<commit_message>
fix: correct Responsible Disclosure URL
</commit_message>
<xml_diff>
--- a/DPN_Technical_Reference_Manual.docx
+++ b/DPN_Technical_Reference_Manual.docx
@@ -6,16 +6,14 @@
       <w:pPr>
         <w:pStyle w:val="Heading1"/>
         <w:spacing w:before="264" w:after="132"/>
-        <w:rPr>
-          <w:sz w:val="52"/>
-          <w:szCs w:val="52"/>
-        </w:rPr>
       </w:pPr>
       <w:r>
         <w:rPr>
           <w:b/>
           <w:bCs/>
           <w:color w:val="111827"/>
+          <w:sz w:val="22"/>
+          <w:szCs w:val="22"/>
         </w:rPr>
         <w:t>dpnranker.com - Technical Reference Manual</w:t>
       </w:r>
@@ -209,7 +207,7 @@
           </w:tcPr>
           <w:p>
             <w:r>
-              <w:t>2.0</w:t>
+              <w:t>5.0</w:t>
             </w:r>
           </w:p>
         </w:tc>
@@ -253,7 +251,7 @@
           </w:tcPr>
           <w:p>
             <w:r>
-              <w:t>July 21, 2026</w:t>
+              <w:t>July 22, 2026</w:t>
             </w:r>
           </w:p>
         </w:tc>
@@ -414,7 +412,7 @@
     </w:p>
     <w:tbl>
       <w:tblPr>
-        <w:tblW w:w="5051" w:type="pct"/>
+        <w:tblW w:w="5000" w:type="pct"/>
         <w:tblBorders>
           <w:top w:val="single" w:sz="4" w:space="0" w:color="D1D5DB"/>
           <w:left w:val="single" w:sz="4" w:space="0" w:color="D1D5DB"/>
@@ -431,9 +429,9 @@
       </w:tblPr>
       <w:tblGrid>
         <w:gridCol w:w="898"/>
-        <w:gridCol w:w="1365"/>
-        <w:gridCol w:w="1791"/>
-        <w:gridCol w:w="6347"/>
+        <w:gridCol w:w="1055"/>
+        <w:gridCol w:w="1999"/>
+        <w:gridCol w:w="6344"/>
       </w:tblGrid>
       <w:tr>
         <w:tblPrEx>
@@ -468,7 +466,7 @@
         </w:tc>
         <w:tc>
           <w:tcPr>
-            <w:tcW w:w="656" w:type="pct"/>
+            <w:tcW w:w="0" w:type="auto"/>
             <w:shd w:val="clear" w:color="auto" w:fill="F3F4F6"/>
             <w:tcMar>
               <w:top w:w="60" w:type="dxa"/>
@@ -489,7 +487,7 @@
         </w:tc>
         <w:tc>
           <w:tcPr>
-            <w:tcW w:w="861" w:type="pct"/>
+            <w:tcW w:w="0" w:type="auto"/>
             <w:shd w:val="clear" w:color="auto" w:fill="F3F4F6"/>
             <w:tcMar>
               <w:top w:w="60" w:type="dxa"/>
@@ -555,7 +553,7 @@
         </w:tc>
         <w:tc>
           <w:tcPr>
-            <w:tcW w:w="656" w:type="pct"/>
+            <w:tcW w:w="0" w:type="auto"/>
             <w:tcMar>
               <w:top w:w="60" w:type="dxa"/>
               <w:left w:w="100" w:type="dxa"/>
@@ -571,7 +569,7 @@
         </w:tc>
         <w:tc>
           <w:tcPr>
-            <w:tcW w:w="861" w:type="pct"/>
+            <w:tcW w:w="0" w:type="auto"/>
             <w:tcMar>
               <w:top w:w="60" w:type="dxa"/>
               <w:left w:w="100" w:type="dxa"/>
@@ -632,7 +630,7 @@
         </w:tc>
         <w:tc>
           <w:tcPr>
-            <w:tcW w:w="656" w:type="pct"/>
+            <w:tcW w:w="0" w:type="auto"/>
             <w:tcMar>
               <w:top w:w="60" w:type="dxa"/>
               <w:left w:w="100" w:type="dxa"/>
@@ -648,38 +646,260 @@
         </w:tc>
         <w:tc>
           <w:tcPr>
-            <w:tcW w:w="861" w:type="pct"/>
-            <w:tcMar>
-              <w:top w:w="60" w:type="dxa"/>
-              <w:left w:w="100" w:type="dxa"/>
-              <w:bottom w:w="60" w:type="dxa"/>
-              <w:right w:w="100" w:type="dxa"/>
-            </w:tcMar>
-          </w:tcPr>
-          <w:p>
+            <w:tcW w:w="0" w:type="auto"/>
+            <w:tcMar>
+              <w:top w:w="60" w:type="dxa"/>
+              <w:left w:w="100" w:type="dxa"/>
+              <w:bottom w:w="60" w:type="dxa"/>
+              <w:right w:w="100" w:type="dxa"/>
+            </w:tcMar>
+          </w:tcPr>
+          <w:p>
+            <w:r>
+              <w:t>Antigravity AI</w:t>
+            </w:r>
+          </w:p>
+        </w:tc>
+        <w:tc>
+          <w:tcPr>
+            <w:tcW w:w="0" w:type="auto"/>
+            <w:tcMar>
+              <w:top w:w="60" w:type="dxa"/>
+              <w:left w:w="100" w:type="dxa"/>
+              <w:bottom w:w="60" w:type="dxa"/>
+              <w:right w:w="100" w:type="dxa"/>
+            </w:tcMar>
+          </w:tcPr>
+          <w:p>
+            <w:r>
+              <w:t>Security improvements including rate limiting, strict HTTP headers, and IDOR prevention details.</w:t>
+            </w:r>
+          </w:p>
+        </w:tc>
+      </w:tr>
+      <w:tr>
+        <w:tblPrEx>
+          <w:tblCellMar>
+            <w:top w:w="0" w:type="dxa"/>
+            <w:bottom w:w="0" w:type="dxa"/>
+          </w:tblCellMar>
+        </w:tblPrEx>
+        <w:tc>
+          <w:tcPr>
+            <w:tcW w:w="0" w:type="auto"/>
+            <w:tcMar>
+              <w:top w:w="60" w:type="dxa"/>
+              <w:left w:w="100" w:type="dxa"/>
+              <w:bottom w:w="60" w:type="dxa"/>
+              <w:right w:w="100" w:type="dxa"/>
+            </w:tcMar>
+          </w:tcPr>
+          <w:p>
+            <w:r>
+              <w:t>3.0</w:t>
+            </w:r>
+          </w:p>
+        </w:tc>
+        <w:tc>
+          <w:tcPr>
+            <w:tcW w:w="0" w:type="auto"/>
+            <w:tcMar>
+              <w:top w:w="60" w:type="dxa"/>
+              <w:left w:w="100" w:type="dxa"/>
+              <w:bottom w:w="60" w:type="dxa"/>
+              <w:right w:w="100" w:type="dxa"/>
+            </w:tcMar>
+          </w:tcPr>
+          <w:p>
+            <w:r>
+              <w:t>2026-07-22</w:t>
+            </w:r>
+          </w:p>
+        </w:tc>
+        <w:tc>
+          <w:tcPr>
+            <w:tcW w:w="0" w:type="auto"/>
+            <w:tcMar>
+              <w:top w:w="60" w:type="dxa"/>
+              <w:left w:w="100" w:type="dxa"/>
+              <w:bottom w:w="60" w:type="dxa"/>
+              <w:right w:w="100" w:type="dxa"/>
+            </w:tcMar>
+          </w:tcPr>
+          <w:p>
+            <w:r>
+              <w:t>Antigravity AI</w:t>
+            </w:r>
+          </w:p>
+        </w:tc>
+        <w:tc>
+          <w:tcPr>
+            <w:tcW w:w="0" w:type="auto"/>
+            <w:tcMar>
+              <w:top w:w="60" w:type="dxa"/>
+              <w:left w:w="100" w:type="dxa"/>
+              <w:bottom w:w="60" w:type="dxa"/>
+              <w:right w:w="100" w:type="dxa"/>
+            </w:tcMar>
+          </w:tcPr>
+          <w:p>
+            <w:r>
+              <w:t xml:space="preserve">Corporate compliance alignment (SAST, </w:t>
+            </w:r>
             <w:proofErr w:type="spellStart"/>
             <w:r>
-              <w:t>Dentsu</w:t>
+              <w:t>Dependabot</w:t>
             </w:r>
             <w:proofErr w:type="spellEnd"/>
             <w:r>
-              <w:t xml:space="preserve"> Podcast Network</w:t>
-            </w:r>
-          </w:p>
-        </w:tc>
-        <w:tc>
-          <w:tcPr>
-            <w:tcW w:w="0" w:type="auto"/>
-            <w:tcMar>
-              <w:top w:w="60" w:type="dxa"/>
-              <w:left w:w="100" w:type="dxa"/>
-              <w:bottom w:w="60" w:type="dxa"/>
-              <w:right w:w="100" w:type="dxa"/>
-            </w:tcMar>
-          </w:tcPr>
-          <w:p>
-            <w:r>
-              <w:t>Security improvements including rate limiting, strict HTTP headers, and IDOR prevention details.</w:t>
+              <w:t>, Responsible Disclosure).</w:t>
+            </w:r>
+          </w:p>
+        </w:tc>
+      </w:tr>
+      <w:tr>
+        <w:tblPrEx>
+          <w:tblCellMar>
+            <w:top w:w="0" w:type="dxa"/>
+            <w:bottom w:w="0" w:type="dxa"/>
+          </w:tblCellMar>
+        </w:tblPrEx>
+        <w:tc>
+          <w:tcPr>
+            <w:tcW w:w="0" w:type="auto"/>
+            <w:tcMar>
+              <w:top w:w="60" w:type="dxa"/>
+              <w:left w:w="100" w:type="dxa"/>
+              <w:bottom w:w="60" w:type="dxa"/>
+              <w:right w:w="100" w:type="dxa"/>
+            </w:tcMar>
+          </w:tcPr>
+          <w:p>
+            <w:r>
+              <w:t>4.0</w:t>
+            </w:r>
+          </w:p>
+        </w:tc>
+        <w:tc>
+          <w:tcPr>
+            <w:tcW w:w="0" w:type="auto"/>
+            <w:tcMar>
+              <w:top w:w="60" w:type="dxa"/>
+              <w:left w:w="100" w:type="dxa"/>
+              <w:bottom w:w="60" w:type="dxa"/>
+              <w:right w:w="100" w:type="dxa"/>
+            </w:tcMar>
+          </w:tcPr>
+          <w:p>
+            <w:r>
+              <w:t>2026-07-22</w:t>
+            </w:r>
+          </w:p>
+        </w:tc>
+        <w:tc>
+          <w:tcPr>
+            <w:tcW w:w="0" w:type="auto"/>
+            <w:tcMar>
+              <w:top w:w="60" w:type="dxa"/>
+              <w:left w:w="100" w:type="dxa"/>
+              <w:bottom w:w="60" w:type="dxa"/>
+              <w:right w:w="100" w:type="dxa"/>
+            </w:tcMar>
+          </w:tcPr>
+          <w:p>
+            <w:r>
+              <w:t>Antigravity AI</w:t>
+            </w:r>
+          </w:p>
+        </w:tc>
+        <w:tc>
+          <w:tcPr>
+            <w:tcW w:w="0" w:type="auto"/>
+            <w:tcMar>
+              <w:top w:w="60" w:type="dxa"/>
+              <w:left w:w="100" w:type="dxa"/>
+              <w:bottom w:w="60" w:type="dxa"/>
+              <w:right w:w="100" w:type="dxa"/>
+            </w:tcMar>
+          </w:tcPr>
+          <w:p>
+            <w:r>
+              <w:t>Corporate compliance a</w:t>
+            </w:r>
+            <w:r>
+              <w:t>lignment (ICT Readiness, Logging, AI).</w:t>
+            </w:r>
+          </w:p>
+        </w:tc>
+      </w:tr>
+      <w:tr>
+        <w:tblPrEx>
+          <w:tblCellMar>
+            <w:top w:w="0" w:type="dxa"/>
+            <w:bottom w:w="0" w:type="dxa"/>
+          </w:tblCellMar>
+        </w:tblPrEx>
+        <w:tc>
+          <w:tcPr>
+            <w:tcW w:w="0" w:type="auto"/>
+            <w:tcMar>
+              <w:top w:w="60" w:type="dxa"/>
+              <w:left w:w="100" w:type="dxa"/>
+              <w:bottom w:w="60" w:type="dxa"/>
+              <w:right w:w="100" w:type="dxa"/>
+            </w:tcMar>
+          </w:tcPr>
+          <w:p>
+            <w:r>
+              <w:t>5.0</w:t>
+            </w:r>
+          </w:p>
+        </w:tc>
+        <w:tc>
+          <w:tcPr>
+            <w:tcW w:w="0" w:type="auto"/>
+            <w:tcMar>
+              <w:top w:w="60" w:type="dxa"/>
+              <w:left w:w="100" w:type="dxa"/>
+              <w:bottom w:w="60" w:type="dxa"/>
+              <w:right w:w="100" w:type="dxa"/>
+            </w:tcMar>
+          </w:tcPr>
+          <w:p>
+            <w:r>
+              <w:t>2026-07-22</w:t>
+            </w:r>
+          </w:p>
+        </w:tc>
+        <w:tc>
+          <w:tcPr>
+            <w:tcW w:w="0" w:type="auto"/>
+            <w:tcMar>
+              <w:top w:w="60" w:type="dxa"/>
+              <w:left w:w="100" w:type="dxa"/>
+              <w:bottom w:w="60" w:type="dxa"/>
+              <w:right w:w="100" w:type="dxa"/>
+            </w:tcMar>
+          </w:tcPr>
+          <w:p>
+            <w:r>
+              <w:t>Antigravity AI</w:t>
+            </w:r>
+          </w:p>
+        </w:tc>
+        <w:tc>
+          <w:tcPr>
+            <w:tcW w:w="0" w:type="auto"/>
+            <w:tcMar>
+              <w:top w:w="60" w:type="dxa"/>
+              <w:left w:w="100" w:type="dxa"/>
+              <w:bottom w:w="60" w:type="dxa"/>
+              <w:right w:w="100" w:type="dxa"/>
+            </w:tcMar>
+          </w:tcPr>
+          <w:p>
+            <w:r>
+              <w:t>Corporate compliance alignment (Resilience, DR/BCP testing).</w:t>
             </w:r>
           </w:p>
         </w:tc>
@@ -729,10 +949,7 @@
       </w:r>
       <w:proofErr w:type="spellEnd"/>
       <w:r>
-        <w:t xml:space="preserve"> Podcast Network. It serves as a centralized creator marketplace </w:t>
-      </w:r>
-      <w:r>
-        <w:t>and algorithmic podcast ranking index.</w:t>
+        <w:t xml:space="preserve"> Podcast Network. It serves as a centralized creator marketplace and algorithmic podcast ranking index.</w:t>
       </w:r>
     </w:p>
     <w:p>
@@ -756,10 +973,13 @@
         <w:spacing w:after="132"/>
       </w:pPr>
       <w:r>
-        <w:t>The platform connects brands, agencies, and podcast creators by aggregating real-time analytics. It replaces fragmented data collection with a unified, transparent, and algorithmic "DPN Score" that no</w:t>
-      </w:r>
-      <w:r>
-        <w:t>rmalizes audience penetration against engagement vectors. This empowers advertisers to make data-driven media investments while giving creators a platform to showcase their verified analytics.</w:t>
+        <w:t>The platform connects brands, agencies, and podcast creators by aggregating r</w:t>
+      </w:r>
+      <w:r>
+        <w:t>eal-time analytics. It replaces fragmented data collection with a unified, transparent, and algorithmic "DPN Score" that normalizes audience penetration against engagement vectors. This empowers advertisers to make data-driven media investments while givin</w:t>
+      </w:r>
+      <w:r>
+        <w:t>g creators a platform to showcase their verified analytics.</w:t>
       </w:r>
     </w:p>
     <w:p>
@@ -795,10 +1015,7 @@
         <w:t>Algorithmic Ranking Engine:</w:t>
       </w:r>
       <w:r>
-        <w:t xml:space="preserve"> Synthesizes logar</w:t>
-      </w:r>
-      <w:r>
-        <w:t>ithmic scaling of 7-day cumulative YouTube audience penetration with relative engagement density vectors.</w:t>
+        <w:t xml:space="preserve"> Synthesizes logarithmic scaling of 7-day cumulative YouTube audience penetration with relative engagement density vectors.</w:t>
       </w:r>
     </w:p>
     <w:p>
@@ -818,7 +1035,10 @@
         <w:t>Creator Management:</w:t>
       </w:r>
       <w:r>
-        <w:t xml:space="preserve"> Automated onboarding workflows allowing creators to securely claim their indexed podcasts via Magic Link verification.</w:t>
+        <w:t xml:space="preserve"> Automat</w:t>
+      </w:r>
+      <w:r>
+        <w:t>ed onboarding workflows allowing creators to securely claim their indexed podcasts via Magic Link verification.</w:t>
       </w:r>
     </w:p>
     <w:p>
@@ -835,6 +1055,7 @@
           <w:b/>
           <w:bCs/>
         </w:rPr>
+        <w:lastRenderedPageBreak/>
         <w:t>Agency Portal:</w:t>
       </w:r>
       <w:r>
@@ -858,7 +1079,10 @@
         <w:t>Admin Orchestration:</w:t>
       </w:r>
       <w:r>
-        <w:t xml:space="preserve"> Centralized Super Admin controls to seed new podcasts, manage rankings, enforce data integrity, and dictate feature flags.</w:t>
+        <w:t xml:space="preserve"> Cent</w:t>
+      </w:r>
+      <w:r>
+        <w:t>ralized Super Admin controls to seed new podcasts, manage rankings, enforce data integrity, and dictate feature flags.</w:t>
       </w:r>
     </w:p>
     <w:p>
@@ -882,7 +1106,6 @@
           <w:sz w:val="22"/>
           <w:szCs w:val="22"/>
         </w:rPr>
-        <w:lastRenderedPageBreak/>
         <w:t>3. System Architecture</w:t>
       </w:r>
     </w:p>
@@ -891,10 +1114,7 @@
         <w:spacing w:after="132"/>
       </w:pPr>
       <w:r>
-        <w:t>The application employs a decoupled, serverless-oriented architecture leveraging Next.js (App Router) backed</w:t>
-      </w:r>
-      <w:r>
-        <w:t xml:space="preserve"> by </w:t>
+        <w:t xml:space="preserve">The application employs a decoupled, serverless-oriented architecture leveraging Next.js (App Router) backed by </w:t>
       </w:r>
       <w:proofErr w:type="spellStart"/>
       <w:r>
@@ -915,7 +1135,7 @@
           <w:noProof/>
         </w:rPr>
         <w:drawing>
-          <wp:inline distT="0" distB="0" distL="0" distR="0" wp14:anchorId="28D98FD0" wp14:editId="3D6EDF01">
+          <wp:inline distT="0" distB="0" distL="0" distR="0" wp14:anchorId="19032BD5" wp14:editId="29B539A9">
             <wp:extent cx="6096000" cy="2800350"/>
             <wp:effectExtent l="0" t="0" r="0" b="0"/>
             <wp:docPr id="1" name="Picture 1"/>
@@ -975,7 +1195,10 @@
         <w:spacing w:after="132"/>
       </w:pPr>
       <w:r>
-        <w:t>The application is currently containerized and deployed via PM2 on a managed Ubuntu VPS (</w:t>
+        <w:t xml:space="preserve">The application is currently containerized and deployed via PM2 on a managed Ubuntu VPS </w:t>
+      </w:r>
+      <w:r>
+        <w:t>(</w:t>
       </w:r>
       <w:proofErr w:type="spellStart"/>
       <w:r>
@@ -1081,14 +1304,7 @@
                 <w:b/>
                 <w:bCs/>
               </w:rPr>
-              <w:t>Catego</w:t>
-            </w:r>
-            <w:r>
-              <w:rPr>
-                <w:b/>
-                <w:bCs/>
-              </w:rPr>
-              <w:t>ry</w:t>
+              <w:t>Category</w:t>
             </w:r>
           </w:p>
         </w:tc>
@@ -1310,7 +1526,14 @@
                 <w:b/>
                 <w:bCs/>
               </w:rPr>
-              <w:t>Tailwind CSS</w:t>
+              <w:t>Tailwind C</w:t>
+            </w:r>
+            <w:r>
+              <w:rPr>
+                <w:b/>
+                <w:bCs/>
+              </w:rPr>
+              <w:t>SS</w:t>
             </w:r>
           </w:p>
         </w:tc>
@@ -1443,10 +1666,7 @@
           </w:tcPr>
           <w:p>
             <w:r>
-              <w:t>Provides the baseline design system (buttons, modals, tooltips) ensuring UI consiste</w:t>
-            </w:r>
-            <w:r>
-              <w:t>ncy.</w:t>
+              <w:t>Provides the baseline design system (buttons, modals, tooltips) ensuring UI consistency.</w:t>
             </w:r>
           </w:p>
         </w:tc>
@@ -1552,6 +1772,7 @@
                 <w:b/>
                 <w:bCs/>
               </w:rPr>
+              <w:lastRenderedPageBreak/>
               <w:t>YouTube API v3</w:t>
             </w:r>
           </w:p>
@@ -1600,7 +1821,10 @@
           </w:tcPr>
           <w:p>
             <w:r>
-              <w:t>Fetches live subscriber counts, views, latest video URLs, and topic categories for algorithmic scoring.</w:t>
+              <w:t>Fetches live subscriber counts, views, latest video URLs, and topic categories for algorithmi</w:t>
+            </w:r>
+            <w:r>
+              <w:t>c scoring.</w:t>
             </w:r>
           </w:p>
         </w:tc>
@@ -1706,7 +1930,6 @@
                 <w:b/>
                 <w:bCs/>
               </w:rPr>
-              <w:lastRenderedPageBreak/>
               <w:t>PM2</w:t>
             </w:r>
           </w:p>
@@ -1820,7 +2043,7 @@
           <w:iCs/>
           <w:color w:val="6B7280"/>
         </w:rPr>
-        <w:t xml:space="preserve"> is utilized as a hosted PaaS,</w:t>
+        <w:t xml:space="preserve"> is utilized as a hosted PaaS, offloading database maintenance, real-time socket management, and authentication infrastructure to a specializ</w:t>
       </w:r>
       <w:r>
         <w:rPr>
@@ -1828,7 +2051,7 @@
           <w:iCs/>
           <w:color w:val="6B7280"/>
         </w:rPr>
-        <w:t xml:space="preserve"> offloading database maintenance, real-time socket management, and authentication infrastructure to a specialized provider.</w:t>
+        <w:t>ed provider.</w:t>
       </w:r>
     </w:p>
     <w:p>
@@ -1928,7 +2151,10 @@
         <w:t>Business Logic:</w:t>
       </w:r>
       <w:r>
-        <w:t xml:space="preserve"> Applies a proprietary, non-linear algorithmic matrix to generate a normalized index.</w:t>
+        <w:t xml:space="preserve"> Applies a proprietary, non-linear algor</w:t>
+      </w:r>
+      <w:r>
+        <w:t>ithmic matrix to generate a normalized index.</w:t>
       </w:r>
     </w:p>
     <w:p>
@@ -1948,10 +2174,7 @@
         <w:t>Dependencies:</w:t>
       </w:r>
       <w:r>
-        <w:t xml:space="preserve"> YouTube</w:t>
-      </w:r>
-      <w:r>
-        <w:t xml:space="preserve"> API, Postgres </w:t>
+        <w:t xml:space="preserve"> YouTube API, Postgres </w:t>
       </w:r>
       <w:r>
         <w:rPr>
@@ -2053,10 +2276,7 @@
         <w:t>Business Logic:</w:t>
       </w:r>
       <w:r>
-        <w:t xml:space="preserve"> </w:t>
-      </w:r>
-      <w:r>
-        <w:t xml:space="preserve">Maps authenticated sessions to </w:t>
+        <w:t xml:space="preserve"> Maps authenticated sessions to </w:t>
       </w:r>
       <w:proofErr w:type="spellStart"/>
       <w:proofErr w:type="gramStart"/>
@@ -2204,7 +2424,10 @@
         <w:t>Business Logic:</w:t>
       </w:r>
       <w:r>
-        <w:t xml:space="preserve"> Allows admins to seed podcasts via YouTube URLs, manually override genres, revoke unauthorized claims, and manually trigger 7-day stat recalculations.</w:t>
+        <w:t xml:space="preserve"> Allows admins to seed </w:t>
+      </w:r>
+      <w:r>
+        <w:t>podcasts via YouTube URLs, manually override genres, revoke unauthorized claims, and manually trigger 7-day stat recalculations.</w:t>
       </w:r>
     </w:p>
     <w:p>
@@ -2270,7 +2493,10 @@
         <w:t>SERVICE_ROLE_KEY</w:t>
       </w:r>
       <w:r>
-        <w:t xml:space="preserve"> to bypass standard RLS when performing global administrative tasks.</w:t>
+        <w:t xml:space="preserve"> to bypass standard RLS when</w:t>
+      </w:r>
+      <w:r>
+        <w:t xml:space="preserve"> performing global administrative tasks.</w:t>
       </w:r>
     </w:p>
     <w:p>
@@ -2336,10 +2562,7 @@
         <w:spacing w:after="132"/>
       </w:pPr>
       <w:r>
-        <w:t>This is a critical security workflow designed to prevent</w:t>
-      </w:r>
-      <w:r>
-        <w:t xml:space="preserve"> Insecure Direct Object Reference (IDOR) takeovers of podcast profiles.</w:t>
+        <w:t>This is a critical security workflow designed to prevent Insecure Direct Object Reference (IDOR) takeovers of podcast profiles.</w:t>
       </w:r>
     </w:p>
     <w:p>
@@ -2352,7 +2575,7 @@
           <w:noProof/>
         </w:rPr>
         <w:drawing>
-          <wp:inline distT="0" distB="0" distL="0" distR="0" wp14:anchorId="616DF06E" wp14:editId="51ADA3FF">
+          <wp:inline distT="0" distB="0" distL="0" distR="0" wp14:anchorId="2871D379" wp14:editId="31CAA2F2">
             <wp:extent cx="6096000" cy="3562350"/>
             <wp:effectExtent l="0" t="0" r="0" b="0"/>
             <wp:docPr id="2" name="Picture 2"/>
@@ -2417,7 +2640,7 @@
           <w:noProof/>
         </w:rPr>
         <w:drawing>
-          <wp:inline distT="0" distB="0" distL="0" distR="0" wp14:anchorId="0D794708" wp14:editId="00A6A5C6">
+          <wp:inline distT="0" distB="0" distL="0" distR="0" wp14:anchorId="45D9FD86" wp14:editId="56DFCED3">
             <wp:extent cx="6096000" cy="2857500"/>
             <wp:effectExtent l="0" t="0" r="0" b="0"/>
             <wp:docPr id="3" name="Picture 3"/>
@@ -2495,7 +2718,17 @@
           <w:szCs w:val="22"/>
         </w:rPr>
         <w:lastRenderedPageBreak/>
-        <w:t>7. API Documentation</w:t>
+        <w:t>7. API Docum</w:t>
+      </w:r>
+      <w:r>
+        <w:rPr>
+          <w:b/>
+          <w:bCs/>
+          <w:color w:val="111827"/>
+          <w:sz w:val="22"/>
+          <w:szCs w:val="22"/>
+        </w:rPr>
+        <w:t>entation</w:t>
       </w:r>
     </w:p>
     <w:p>
@@ -2593,9 +2826,8 @@
           <w:szCs w:val="20"/>
           <w:shd w:val="clear" w:color="auto" w:fill="F3F4F6"/>
         </w:rPr>
-        <w:t>refreshSevenDayViews</w:t>
-      </w:r>
-      <w:proofErr w:type="spellEnd"/>
+        <w:t>refreshSevenDayVie</w:t>
+      </w:r>
       <w:r>
         <w:rPr>
           <w:rFonts w:ascii="Consolas" w:eastAsia="Consolas" w:hAnsi="Consolas" w:cs="Consolas"/>
@@ -2603,9 +2835,9 @@
           <w:szCs w:val="20"/>
           <w:shd w:val="clear" w:color="auto" w:fill="F3F4F6"/>
         </w:rPr>
-        <w:t>(</w:t>
-      </w:r>
-      <w:proofErr w:type="gramEnd"/>
+        <w:t>ws</w:t>
+      </w:r>
+      <w:proofErr w:type="spellEnd"/>
       <w:r>
         <w:rPr>
           <w:rFonts w:ascii="Consolas" w:eastAsia="Consolas" w:hAnsi="Consolas" w:cs="Consolas"/>
@@ -2613,13 +2845,20 @@
           <w:szCs w:val="20"/>
           <w:shd w:val="clear" w:color="auto" w:fill="F3F4F6"/>
         </w:rPr>
+        <w:t>(</w:t>
+      </w:r>
+      <w:proofErr w:type="gramEnd"/>
+      <w:r>
+        <w:rPr>
+          <w:rFonts w:ascii="Consolas" w:eastAsia="Consolas" w:hAnsi="Consolas" w:cs="Consolas"/>
+          <w:sz w:val="20"/>
+          <w:szCs w:val="20"/>
+          <w:shd w:val="clear" w:color="auto" w:fill="F3F4F6"/>
+        </w:rPr>
         <w:t>)</w:t>
       </w:r>
       <w:r>
-        <w:t>: Iterates over all approved podcasts t</w:t>
-      </w:r>
-      <w:r>
-        <w:t>o fetch current metrics and calculate the 7-day delta.</w:t>
+        <w:t>: Iterates over all approved podcasts to fetch current metrics and calculate the 7-day delta.</w:t>
       </w:r>
     </w:p>
     <w:p>
@@ -2803,7 +3042,10 @@
         <w:t>Error Handling:</w:t>
       </w:r>
       <w:r>
-        <w:t xml:space="preserve"> Graceful fallbacks implemented. If the API fails or rate limits are hit, the application retains the most recent valid snapshot.</w:t>
+        <w:t xml:space="preserve"> Graceful fa</w:t>
+      </w:r>
+      <w:r>
+        <w:t>llbacks implemented. If the API fails or rate limits are hit, the application retains the most recent valid snapshot.</w:t>
       </w:r>
     </w:p>
     <w:p>
@@ -2983,10 +3225,7 @@
         <w:t>profiles.id</w:t>
       </w:r>
       <w:r>
-        <w:t xml:space="preserve"> </w:t>
-      </w:r>
-      <w:r>
-        <w:t xml:space="preserve">via </w:t>
+        <w:t xml:space="preserve"> via </w:t>
       </w:r>
       <w:proofErr w:type="spellStart"/>
       <w:r>
@@ -3026,7 +3265,10 @@
       </w:r>
       <w:proofErr w:type="spellEnd"/>
       <w:r>
-        <w:t xml:space="preserve">: Time-series table logging daily snapshots of </w:t>
+        <w:t>: Time-series table logging daily sna</w:t>
+      </w:r>
+      <w:r>
+        <w:t xml:space="preserve">pshots of </w:t>
       </w:r>
       <w:proofErr w:type="spellStart"/>
       <w:r>
@@ -3089,23 +3331,21 @@
         <w:spacing w:after="88"/>
         <w:ind w:left="360"/>
       </w:pPr>
-      <w:proofErr w:type="gramStart"/>
       <w:r>
         <w:rPr>
           <w:i/>
           <w:iCs/>
           <w:color w:val="6B7280"/>
         </w:rPr>
-        <w:t>[!TIP</w:t>
-      </w:r>
-      <w:proofErr w:type="gramEnd"/>
+        <w:t>TIP</w:t>
+      </w:r>
       <w:r>
         <w:rPr>
           <w:i/>
           <w:iCs/>
           <w:color w:val="6B7280"/>
         </w:rPr>
-        <w:t>]</w:t>
+        <w:t>:</w:t>
       </w:r>
       <w:r>
         <w:br/>
@@ -3245,23 +3485,6 @@
     </w:p>
     <w:p>
       <w:pPr>
-        <w:rPr>
-          <w:b/>
-          <w:bCs/>
-          <w:color w:val="111827"/>
-        </w:rPr>
-      </w:pPr>
-      <w:r>
-        <w:rPr>
-          <w:b/>
-          <w:bCs/>
-          <w:color w:val="111827"/>
-        </w:rPr>
-        <w:br w:type="page"/>
-      </w:r>
-    </w:p>
-    <w:p>
-      <w:pPr>
         <w:pStyle w:val="Heading2"/>
         <w:spacing w:before="211" w:after="106"/>
       </w:pPr>
@@ -3273,7 +3496,6 @@
           <w:sz w:val="22"/>
           <w:szCs w:val="22"/>
         </w:rPr>
-        <w:lastRenderedPageBreak/>
         <w:t>9. Security Architecture</w:t>
       </w:r>
     </w:p>
@@ -3298,17 +3520,7 @@
           <w:sz w:val="22"/>
           <w:szCs w:val="22"/>
         </w:rPr>
-        <w:t>9.1. Access Control</w:t>
-      </w:r>
-      <w:r>
-        <w:rPr>
-          <w:b/>
-          <w:bCs/>
-          <w:color w:val="111827"/>
-          <w:sz w:val="22"/>
-          <w:szCs w:val="22"/>
-        </w:rPr>
-        <w:t xml:space="preserve"> &amp; IAM</w:t>
+        <w:t>9.1. Access Control &amp; IAM</w:t>
       </w:r>
     </w:p>
     <w:p>
@@ -3344,7 +3556,10 @@
       </w:r>
       <w:proofErr w:type="spellEnd"/>
       <w:r>
-        <w:t>), ensuring industry-standard hashing, session management, and JWT signing.</w:t>
+        <w:t>),</w:t>
+      </w:r>
+      <w:r>
+        <w:t xml:space="preserve"> ensuring industry-standard hashing, session management, and JWT signing.</w:t>
       </w:r>
     </w:p>
     <w:p>
@@ -3418,7 +3633,10 @@
         <w:t>Server-Side Authorization:</w:t>
       </w:r>
       <w:r>
-        <w:t xml:space="preserve"> Next.js Server Actions re-verify permissions utilizing a rigorous </w:t>
+        <w:t xml:space="preserve"> Next.js Server Ac</w:t>
+      </w:r>
+      <w:r>
+        <w:t xml:space="preserve">tions re-verify permissions utilizing a rigorous </w:t>
       </w:r>
       <w:proofErr w:type="spellStart"/>
       <w:proofErr w:type="gramStart"/>
@@ -3452,10 +3670,24 @@
         <w:t>)</w:t>
       </w:r>
       <w:r>
-        <w:t xml:space="preserve"> utility before processing administr</w:t>
-      </w:r>
-      <w:r>
-        <w:t>ative state mutations.</w:t>
+        <w:t xml:space="preserve"> utility before processing administrative state mutations.</w:t>
+      </w:r>
+    </w:p>
+    <w:p>
+      <w:pPr>
+        <w:rPr>
+          <w:b/>
+          <w:bCs/>
+          <w:color w:val="111827"/>
+        </w:rPr>
+      </w:pPr>
+      <w:r>
+        <w:rPr>
+          <w:b/>
+          <w:bCs/>
+          <w:color w:val="111827"/>
+        </w:rPr>
+        <w:br w:type="page"/>
       </w:r>
     </w:p>
     <w:p>
@@ -3471,6 +3703,7 @@
           <w:sz w:val="22"/>
           <w:szCs w:val="22"/>
         </w:rPr>
+        <w:lastRenderedPageBreak/>
         <w:t>9.2. Protection Against Common Threats</w:t>
       </w:r>
     </w:p>
@@ -3689,7 +3922,14 @@
                 <w:b/>
                 <w:bCs/>
               </w:rPr>
-              <w:t>CSRF (Cross-Site Request Forgery)</w:t>
+              <w:t>CSRF (Cross</w:t>
+            </w:r>
+            <w:r>
+              <w:rPr>
+                <w:b/>
+                <w:bCs/>
+              </w:rPr>
+              <w:t>-Site Request Forgery)</w:t>
             </w:r>
           </w:p>
         </w:tc>
@@ -3733,14 +3973,7 @@
                 <w:b/>
                 <w:bCs/>
               </w:rPr>
-              <w:t>IDOR / Privi</w:t>
-            </w:r>
-            <w:r>
-              <w:rPr>
-                <w:b/>
-                <w:bCs/>
-              </w:rPr>
-              <w:t>lege Escalation</w:t>
+              <w:t>IDOR / Privilege Escalation</w:t>
             </w:r>
           </w:p>
         </w:tc>
@@ -3894,10 +4127,10 @@
           </w:tcPr>
           <w:p>
             <w:r>
-              <w:t xml:space="preserve">In-memory IP-based rate </w:t>
-            </w:r>
-            <w:r>
-              <w:t xml:space="preserve">limiting is enforced on sensitive forms (e.g., </w:t>
+              <w:t>In-memory IP-based rate limiting is enforced on sensitive forms (e</w:t>
+            </w:r>
+            <w:r>
+              <w:t xml:space="preserve">.g., </w:t>
             </w:r>
             <w:proofErr w:type="spellStart"/>
             <w:r>
@@ -4010,19 +4243,13 @@
                 <w:szCs w:val="20"/>
                 <w:shd w:val="clear" w:color="auto" w:fill="F3F4F6"/>
               </w:rPr>
-              <w:t>Strict-T</w:t>
-            </w:r>
-            <w:r>
-              <w:rPr>
-                <w:rFonts w:ascii="Consolas" w:eastAsia="Consolas" w:hAnsi="Consolas" w:cs="Consolas"/>
-                <w:sz w:val="20"/>
-                <w:szCs w:val="20"/>
-                <w:shd w:val="clear" w:color="auto" w:fill="F3F4F6"/>
-              </w:rPr>
-              <w:t>ransport-Security</w:t>
-            </w:r>
-            <w:r>
-              <w:t xml:space="preserve"> headers on all responses.</w:t>
+              <w:t>Strict-Transport-Security</w:t>
+            </w:r>
+            <w:r>
+              <w:t xml:space="preserve"> headers on all responses</w:t>
+            </w:r>
+            <w:r>
+              <w:t>.</w:t>
             </w:r>
           </w:p>
         </w:tc>
@@ -4036,23 +4263,21 @@
         <w:spacing w:after="88"/>
         <w:ind w:left="360"/>
       </w:pPr>
-      <w:proofErr w:type="gramStart"/>
       <w:r>
         <w:rPr>
           <w:i/>
           <w:iCs/>
           <w:color w:val="6B7280"/>
         </w:rPr>
-        <w:t>[!CAUTION</w:t>
-      </w:r>
-      <w:proofErr w:type="gramEnd"/>
+        <w:t>CAUTION</w:t>
+      </w:r>
       <w:r>
         <w:rPr>
           <w:i/>
           <w:iCs/>
           <w:color w:val="6B7280"/>
         </w:rPr>
-        <w:t>]</w:t>
+        <w:t>:</w:t>
       </w:r>
       <w:r>
         <w:br/>
@@ -4119,7 +4344,15 @@
           <w:iCs/>
           <w:color w:val="6B7280"/>
         </w:rPr>
-        <w:t xml:space="preserve"> to bypass Row Level Security. This is a design requirement for global admin actions. The security of this bypass relies entirely on the integrity of the </w:t>
+        <w:t xml:space="preserve"> to bypass Row Level Security. This is a design requirement for global admin actions. The security of this bypass relies entirely on the integrity of</w:t>
+      </w:r>
+      <w:r>
+        <w:rPr>
+          <w:i/>
+          <w:iCs/>
+          <w:color w:val="6B7280"/>
+        </w:rPr>
+        <w:t xml:space="preserve"> the </w:t>
       </w:r>
       <w:proofErr w:type="spellStart"/>
       <w:proofErr w:type="gramStart"/>
@@ -4252,18 +4485,13 @@
           <w:b/>
           <w:bCs/>
         </w:rPr>
-        <w:lastRenderedPageBreak/>
-        <w:t>Consent Man</w:t>
-      </w:r>
-      <w:r>
-        <w:rPr>
-          <w:b/>
-          <w:bCs/>
-        </w:rPr>
-        <w:t>agement:</w:t>
-      </w:r>
-      <w:r>
-        <w:t xml:space="preserve"> Through our Creator and Agency signup forms, users are presented with clear opt-in requirements. Users provide express consent prior to sharing any personal or corporate information onto the platform.</w:t>
+        <w:t>Consent Management:</w:t>
+      </w:r>
+      <w:r>
+        <w:t xml:space="preserve"> Through our Creator an</w:t>
+      </w:r>
+      <w:r>
+        <w:t>d Agency signup forms, users are presented with clear opt-in requirements. Users provide express consent prior to sharing any personal or corporate information onto the platform.</w:t>
       </w:r>
     </w:p>
     <w:p>
@@ -4283,10 +4511,10 @@
         <w:t>Purpose Limitation:</w:t>
       </w:r>
       <w:r>
-        <w:t xml:space="preserve"> Information collected thro</w:t>
-      </w:r>
-      <w:r>
-        <w:t>ugh verified opt-ins is used strictly for platform services (such as matchmaking creators with agencies) and is not repurposed or sold to non-participating third parties.</w:t>
+        <w:t xml:space="preserve"> Information collected through verified opt-ins is used st</w:t>
+      </w:r>
+      <w:r>
+        <w:t>rictly for platform services (such as matchmaking creators with agencies) and is not repurposed or sold to non-participating third parties.</w:t>
       </w:r>
     </w:p>
     <w:p>
@@ -4355,14 +4583,7 @@
           <w:b/>
           <w:bCs/>
         </w:rPr>
-        <w:t xml:space="preserve">Process </w:t>
-      </w:r>
-      <w:r>
-        <w:rPr>
-          <w:b/>
-          <w:bCs/>
-        </w:rPr>
-        <w:t>Management:</w:t>
+        <w:t>Process Management:</w:t>
       </w:r>
       <w:r>
         <w:t xml:space="preserve"> </w:t>
@@ -4377,7 +4598,10 @@
         <w:t>pm2</w:t>
       </w:r>
       <w:r>
-        <w:t xml:space="preserve"> ensures process persistence and automatic restarts on crash.</w:t>
+        <w:t xml:space="preserve"> ensures process</w:t>
+      </w:r>
+      <w:r>
+        <w:t xml:space="preserve"> persistence and automatic restarts on crash.</w:t>
       </w:r>
     </w:p>
     <w:p>
@@ -4422,13 +4646,264 @@
           <w:b/>
           <w:bCs/>
         </w:rPr>
+        <w:lastRenderedPageBreak/>
         <w:t>Graceful Degradation:</w:t>
       </w:r>
       <w:r>
-        <w:t xml:space="preserve"> If the YouTube API experiences an outage, the</w:t>
-      </w:r>
-      <w:r>
-        <w:t xml:space="preserve"> platform gracefully degrades by displaying the last known cached metrics rather than returning 500 errors to the client.</w:t>
+        <w:t xml:space="preserve"> If the YouTube API experiences an outage, the platform gracefully degrades b</w:t>
+      </w:r>
+      <w:r>
+        <w:t>y displaying the last known cached metrics rather than returning 500 errors to the client.</w:t>
+      </w:r>
+    </w:p>
+    <w:p>
+      <w:pPr>
+        <w:pStyle w:val="Heading3"/>
+        <w:spacing w:before="178" w:after="89"/>
+      </w:pPr>
+      <w:r>
+        <w:rPr>
+          <w:b/>
+          <w:bCs/>
+          <w:color w:val="111827"/>
+          <w:sz w:val="22"/>
+          <w:szCs w:val="22"/>
+        </w:rPr>
+        <w:t>ICT Readiness &amp; Disaster Recovery</w:t>
+      </w:r>
+    </w:p>
+    <w:p>
+      <w:pPr>
+        <w:spacing w:after="132"/>
+      </w:pPr>
+      <w:r>
+        <w:t xml:space="preserve">Per the </w:t>
+      </w:r>
+      <w:r>
+        <w:rPr>
+          <w:b/>
+          <w:bCs/>
+        </w:rPr>
+        <w:t>ICT Readiness Standard [RMS142]</w:t>
+      </w:r>
+      <w:r>
+        <w:t xml:space="preserve">, this platform is classified as </w:t>
+      </w:r>
+      <w:r>
+        <w:rPr>
+          <w:b/>
+          <w:bCs/>
+        </w:rPr>
+        <w:t>Tier 3 (Non-critical)</w:t>
+      </w:r>
+      <w:r>
+        <w:t xml:space="preserve"> / </w:t>
+      </w:r>
+      <w:r>
+        <w:rPr>
+          <w:b/>
+          <w:bCs/>
+        </w:rPr>
+        <w:t>Tier 2 (Operational)</w:t>
+      </w:r>
+      <w:r>
+        <w:t>.</w:t>
+      </w:r>
+    </w:p>
+    <w:p>
+      <w:pPr>
+        <w:pStyle w:val="ListParagraph"/>
+        <w:numPr>
+          <w:ilvl w:val="0"/>
+          <w:numId w:val="1"/>
+        </w:numPr>
+        <w:spacing w:after="44"/>
+      </w:pPr>
+      <w:r>
+        <w:rPr>
+          <w:b/>
+          <w:bCs/>
+        </w:rPr>
+        <w:t>Recovery Poin</w:t>
+      </w:r>
+      <w:r>
+        <w:rPr>
+          <w:b/>
+          <w:bCs/>
+        </w:rPr>
+        <w:t>t Objective (RPO):</w:t>
+      </w:r>
+      <w:r>
+        <w:t xml:space="preserve"> &lt; 24 hours (facilitated by daily </w:t>
+      </w:r>
+      <w:proofErr w:type="spellStart"/>
+      <w:r>
+        <w:t>Supabase</w:t>
+      </w:r>
+      <w:proofErr w:type="spellEnd"/>
+      <w:r>
+        <w:t xml:space="preserve"> database snapshots).</w:t>
+      </w:r>
+    </w:p>
+    <w:p>
+      <w:pPr>
+        <w:pStyle w:val="ListParagraph"/>
+        <w:numPr>
+          <w:ilvl w:val="0"/>
+          <w:numId w:val="1"/>
+        </w:numPr>
+        <w:spacing w:after="44"/>
+      </w:pPr>
+      <w:r>
+        <w:rPr>
+          <w:b/>
+          <w:bCs/>
+        </w:rPr>
+        <w:t>Recovery Time Objective (RTO):</w:t>
+      </w:r>
+      <w:r>
+        <w:t xml:space="preserve"> &lt; 48 hours (facilitated by redeploying the Docker/Node instance via GitHub).</w:t>
+      </w:r>
+    </w:p>
+    <w:p>
+      <w:pPr>
+        <w:pStyle w:val="ListParagraph"/>
+        <w:numPr>
+          <w:ilvl w:val="0"/>
+          <w:numId w:val="1"/>
+        </w:numPr>
+        <w:spacing w:after="44"/>
+      </w:pPr>
+      <w:r>
+        <w:rPr>
+          <w:b/>
+          <w:bCs/>
+        </w:rPr>
+        <w:t>Validation:</w:t>
+      </w:r>
+      <w:r>
+        <w:t xml:space="preserve"> Business Continuity Plans (BCP) and Disaster Recovery </w:t>
+      </w:r>
+      <w:r>
+        <w:t xml:space="preserve">(DR) capabilities are validated and tested annually in compliance with the </w:t>
+      </w:r>
+      <w:r>
+        <w:rPr>
+          <w:b/>
+          <w:bCs/>
+        </w:rPr>
+        <w:t>International Markets Resilience Policy [IM/R/001]</w:t>
+      </w:r>
+      <w:r>
+        <w:t>.</w:t>
+      </w:r>
+    </w:p>
+    <w:p>
+      <w:pPr>
+        <w:pStyle w:val="Heading3"/>
+        <w:spacing w:before="178" w:after="89"/>
+      </w:pPr>
+      <w:r>
+        <w:rPr>
+          <w:b/>
+          <w:bCs/>
+          <w:color w:val="111827"/>
+          <w:sz w:val="22"/>
+          <w:szCs w:val="22"/>
+        </w:rPr>
+        <w:t>Security Logging &amp; SIEM Integration</w:t>
+      </w:r>
+    </w:p>
+    <w:p>
+      <w:pPr>
+        <w:spacing w:after="132"/>
+      </w:pPr>
+      <w:r>
+        <w:t xml:space="preserve">Per the </w:t>
+      </w:r>
+      <w:r>
+        <w:rPr>
+          <w:b/>
+          <w:bCs/>
+        </w:rPr>
+        <w:t>Security Logging, Monitoring and Alerting Standard [SCS-GRP-008-EN]</w:t>
+      </w:r>
+      <w:r>
+        <w:t>, all PM2 applicat</w:t>
+      </w:r>
+      <w:r>
+        <w:t xml:space="preserve">ion logs and </w:t>
+      </w:r>
+      <w:proofErr w:type="spellStart"/>
+      <w:r>
+        <w:t>Supabase</w:t>
+      </w:r>
+      <w:proofErr w:type="spellEnd"/>
+      <w:r>
+        <w:t xml:space="preserve"> </w:t>
+      </w:r>
+      <w:proofErr w:type="spellStart"/>
+      <w:r>
+        <w:t>GoTrue</w:t>
+      </w:r>
+      <w:proofErr w:type="spellEnd"/>
+      <w:r>
+        <w:t xml:space="preserve"> Auth logs must be ingested into the </w:t>
+      </w:r>
+      <w:proofErr w:type="spellStart"/>
+      <w:r>
+        <w:t>Dentsu</w:t>
+      </w:r>
+      <w:proofErr w:type="spellEnd"/>
+      <w:r>
+        <w:t xml:space="preserve"> central SIEM platform for 13-month tamper-proof retention. Local PM2 logs only persist temporarily.</w:t>
+      </w:r>
+    </w:p>
+    <w:p>
+      <w:pPr>
+        <w:pStyle w:val="Heading3"/>
+        <w:spacing w:before="178" w:after="89"/>
+      </w:pPr>
+      <w:r>
+        <w:rPr>
+          <w:b/>
+          <w:bCs/>
+          <w:color w:val="111827"/>
+          <w:sz w:val="22"/>
+          <w:szCs w:val="22"/>
+        </w:rPr>
+        <w:t>AI Compliance Declaration</w:t>
+      </w:r>
+    </w:p>
+    <w:p>
+      <w:pPr>
+        <w:spacing w:after="132"/>
+      </w:pPr>
+      <w:r>
+        <w:t xml:space="preserve">Per the </w:t>
+      </w:r>
+      <w:r>
+        <w:rPr>
+          <w:b/>
+          <w:bCs/>
+        </w:rPr>
+        <w:t>AI Security Standard [SCS-GRP-025-EN]</w:t>
+      </w:r>
+      <w:r>
+        <w:t>, this platfo</w:t>
+      </w:r>
+      <w:r>
+        <w:t xml:space="preserve">rm does </w:t>
+      </w:r>
+      <w:r>
+        <w:rPr>
+          <w:b/>
+          <w:bCs/>
+        </w:rPr>
+        <w:t>NOT</w:t>
+      </w:r>
+      <w:r>
+        <w:t xml:space="preserve"> utilize any Generative AI, Large Language Models (LLMs), or Agentic AI components. As such, no AI Warning Banners or prompt moderation pipelines are necessary.</w:t>
       </w:r>
     </w:p>
     <w:p>
@@ -4494,10 +4969,7 @@
       </w:r>
       <w:proofErr w:type="spellStart"/>
       <w:r>
-        <w:t>Hostinge</w:t>
-      </w:r>
-      <w:r>
-        <w:t>r</w:t>
+        <w:t>Hostinger</w:t>
       </w:r>
       <w:proofErr w:type="spellEnd"/>
       <w:r>
@@ -4595,6 +5067,50 @@
     <w:p>
       <w:pPr>
         <w:pBdr>
+          <w:left w:val="single" w:sz="12" w:space="12" w:color="D1D5DB"/>
+        </w:pBdr>
+        <w:spacing w:after="88"/>
+        <w:ind w:left="360"/>
+      </w:pPr>
+      <w:r>
+        <w:rPr>
+          <w:i/>
+          <w:iCs/>
+          <w:color w:val="6B7280"/>
+        </w:rPr>
+        <w:t>IMPORTANT</w:t>
+      </w:r>
+      <w:r>
+        <w:rPr>
+          <w:i/>
+          <w:iCs/>
+          <w:color w:val="6B7280"/>
+        </w:rPr>
+        <w:t>:</w:t>
+      </w:r>
+      <w:r>
+        <w:br/>
+      </w:r>
+      <w:r>
+        <w:rPr>
+          <w:i/>
+          <w:iCs/>
+          <w:color w:val="6B7280"/>
+        </w:rPr>
+        <w:t xml:space="preserve"> This manual CI/CD pipeline is sufficient for v1.0 but may tr</w:t>
+      </w:r>
+      <w:r>
+        <w:rPr>
+          <w:i/>
+          <w:iCs/>
+          <w:color w:val="6B7280"/>
+        </w:rPr>
+        <w:t>ansition to automated GitHub Actions in future iterations to enforce testing gates before deployment.</w:t>
+      </w:r>
+    </w:p>
+    <w:p>
+      <w:pPr>
+        <w:pBdr>
           <w:bottom w:val="single" w:sz="6" w:space="0" w:color="D1D5DB"/>
         </w:pBdr>
         <w:spacing w:before="120" w:after="120"/>
@@ -4649,7 +5165,10 @@
         <w:t>YouTube API Stability:</w:t>
       </w:r>
       <w:r>
-        <w:t xml:space="preserve"> The algorithmic engine assumes the YouTube API schema and quota availability will remain consistent.</w:t>
+        <w:t xml:space="preserve"> The algorithmic engine assumes the YouTube API schema and quota availability will re</w:t>
+      </w:r>
+      <w:r>
+        <w:t>main consistent.</w:t>
       </w:r>
     </w:p>
     <w:p>
@@ -4669,10 +5188,7 @@
         <w:t>Single Node Deployment:</w:t>
       </w:r>
       <w:r>
-        <w:t xml:space="preserve"> The Next.js application runs on a single VPS. It assumes traffic patterns will remain within the vertical scaling limits of the in</w:t>
-      </w:r>
-      <w:r>
-        <w:t>stance.</w:t>
+        <w:t xml:space="preserve"> The Next.js application runs on a single VPS. It assumes traffic patterns will remain within the vertical scaling limits of the instance.</w:t>
       </w:r>
     </w:p>
     <w:p>
@@ -4708,7 +5224,10 @@
         <w:t>Admin Gateway Exposure:</w:t>
       </w:r>
       <w:r>
-        <w:t xml:space="preserve"> While server actions are heavily gated behind </w:t>
+        <w:t xml:space="preserve"> While server actions are heavily gate</w:t>
+      </w:r>
+      <w:r>
+        <w:t xml:space="preserve">d behind </w:t>
       </w:r>
       <w:proofErr w:type="spellStart"/>
       <w:proofErr w:type="gramStart"/>
@@ -4811,7 +5330,7 @@
         <w:t>Version:</w:t>
       </w:r>
       <w:r>
-        <w:t xml:space="preserve"> 2.0</w:t>
+        <w:t xml:space="preserve"> 5.0</w:t>
       </w:r>
       <w:r>
         <w:br/>
@@ -4827,7 +5346,7 @@
         <w:t>Release Date:</w:t>
       </w:r>
       <w:r>
-        <w:t xml:space="preserve"> July 21, 2026</w:t>
+        <w:t xml:space="preserve"> July 22, 2026</w:t>
       </w:r>
       <w:r>
         <w:br/>
@@ -4843,7 +5362,7 @@
         <w:t>Summary:</w:t>
       </w:r>
       <w:r>
-        <w:t xml:space="preserve"> Security Hardening and Top Gainers Logic</w:t>
+        <w:t xml:space="preserve"> Resilience and Disaster Recovery Compliance</w:t>
       </w:r>
     </w:p>
     <w:p>
@@ -4855,7 +5374,14 @@
           <w:b/>
           <w:bCs/>
         </w:rPr>
-        <w:t>New Features</w:t>
+        <w:t>Compliance Imp</w:t>
+      </w:r>
+      <w:r>
+        <w:rPr>
+          <w:b/>
+          <w:bCs/>
+        </w:rPr>
+        <w:t>rovements</w:t>
       </w:r>
     </w:p>
     <w:p>
@@ -4868,7 +5394,74 @@
         <w:spacing w:after="44"/>
       </w:pPr>
       <w:r>
-        <w:t>Introduced "Top Gainers" and "Losers" filters on the main Labs Rankings, correctly isolating changes strictly within the Top 100.</w:t>
+        <w:t>Formally documented adherence to the International Markets Resilience Policy [IM/R/001] for annual DR validation and BCP testing.</w:t>
+      </w:r>
+    </w:p>
+    <w:p>
+      <w:pPr>
+        <w:pBdr>
+          <w:bottom w:val="single" w:sz="6" w:space="0" w:color="D1D5DB"/>
+        </w:pBdr>
+        <w:spacing w:before="120" w:after="120"/>
+      </w:pPr>
+    </w:p>
+    <w:p>
+      <w:pPr>
+        <w:spacing w:after="132"/>
+      </w:pPr>
+      <w:r>
+        <w:rPr>
+          <w:b/>
+          <w:bCs/>
+        </w:rPr>
+        <w:t>Version:</w:t>
+      </w:r>
+      <w:r>
+        <w:t xml:space="preserve"> 4.0</w:t>
+      </w:r>
+      <w:r>
+        <w:br/>
+      </w:r>
+      <w:r>
+        <w:t xml:space="preserve"> </w:t>
+      </w:r>
+      <w:r>
+        <w:rPr>
+          <w:b/>
+          <w:bCs/>
+        </w:rPr>
+        <w:t>Release Date:</w:t>
+      </w:r>
+      <w:r>
+        <w:t xml:space="preserve"> July 22, 2026</w:t>
+      </w:r>
+      <w:r>
+        <w:br/>
+      </w:r>
+      <w:r>
+        <w:t xml:space="preserve"> </w:t>
+      </w:r>
+      <w:r>
+        <w:rPr>
+          <w:b/>
+          <w:bCs/>
+        </w:rPr>
+        <w:t>Summary:</w:t>
+      </w:r>
+      <w:r>
+        <w:t xml:space="preserve"> Advanced Corporate Security Compliance</w:t>
+      </w:r>
+    </w:p>
+    <w:p>
+      <w:pPr>
+        <w:spacing w:after="132"/>
+      </w:pPr>
+      <w:r>
+        <w:rPr>
+          <w:b/>
+          <w:bCs/>
+        </w:rPr>
+        <w:t>Compliance Improvements</w:t>
       </w:r>
     </w:p>
     <w:p>
@@ -4881,31 +5474,7 @@
         <w:spacing w:after="44"/>
       </w:pPr>
       <w:r>
-        <w:t>Implemented "NEW" badge logic to c</w:t>
-      </w:r>
-      <w:r>
-        <w:t>learly distinguish brand-new entries breaking into the Top 100 without prior historical data.</w:t>
-      </w:r>
-    </w:p>
-    <w:p>
-      <w:pPr>
-        <w:spacing w:after="132"/>
-        <w:rPr>
-          <w:b/>
-          <w:bCs/>
-        </w:rPr>
-      </w:pPr>
-    </w:p>
-    <w:p>
-      <w:pPr>
-        <w:spacing w:after="132"/>
-      </w:pPr>
-      <w:r>
-        <w:rPr>
-          <w:b/>
-          <w:bCs/>
-        </w:rPr>
-        <w:t>Security Improvements</w:t>
+        <w:t>Defined ICT Readiness Tier (Tier 3), RPO (&lt;24h), and RTO (&lt;48h) in alignment with RMS142.</w:t>
       </w:r>
     </w:p>
     <w:p>
@@ -4918,57 +5487,7 @@
         <w:spacing w:after="44"/>
       </w:pPr>
       <w:r>
-        <w:t>Implemented strict HTTP Security Headers (</w:t>
-      </w:r>
-      <w:r>
-        <w:rPr>
-          <w:rFonts w:ascii="Consolas" w:eastAsia="Consolas" w:hAnsi="Consolas" w:cs="Consolas"/>
-          <w:sz w:val="20"/>
-          <w:szCs w:val="20"/>
-          <w:shd w:val="clear" w:color="auto" w:fill="F3F4F6"/>
-        </w:rPr>
-        <w:t>X-Frame-Options</w:t>
-      </w:r>
-      <w:r>
-        <w:t xml:space="preserve">, </w:t>
-      </w:r>
-      <w:r>
-        <w:rPr>
-          <w:rFonts w:ascii="Consolas" w:eastAsia="Consolas" w:hAnsi="Consolas" w:cs="Consolas"/>
-          <w:sz w:val="20"/>
-          <w:szCs w:val="20"/>
-          <w:shd w:val="clear" w:color="auto" w:fill="F3F4F6"/>
-        </w:rPr>
-        <w:t>X-Content-Type-Options</w:t>
-      </w:r>
-      <w:r>
-        <w:t xml:space="preserve">, </w:t>
-      </w:r>
-      <w:r>
-        <w:rPr>
-          <w:rFonts w:ascii="Consolas" w:eastAsia="Consolas" w:hAnsi="Consolas" w:cs="Consolas"/>
-          <w:sz w:val="20"/>
-          <w:szCs w:val="20"/>
-          <w:shd w:val="clear" w:color="auto" w:fill="F3F4F6"/>
-        </w:rPr>
-        <w:t>Strict-Transport-Security</w:t>
-      </w:r>
-      <w:r>
-        <w:t xml:space="preserve">) via </w:t>
-      </w:r>
-      <w:proofErr w:type="spellStart"/>
-      <w:r>
-        <w:rPr>
-          <w:rFonts w:ascii="Consolas" w:eastAsia="Consolas" w:hAnsi="Consolas" w:cs="Consolas"/>
-          <w:sz w:val="20"/>
-          <w:szCs w:val="20"/>
-          <w:shd w:val="clear" w:color="auto" w:fill="F3F4F6"/>
-        </w:rPr>
-        <w:t>next.config.ts</w:t>
-      </w:r>
-      <w:proofErr w:type="spellEnd"/>
-      <w:r>
-        <w:t>.</w:t>
+        <w:t>Explicitly documented SIEM ingestion requirements for 13-month log retention in alignment with SCS-GRP-008-EN.</w:t>
       </w:r>
     </w:p>
     <w:p>
@@ -4981,10 +5500,10 @@
         <w:spacing w:after="44"/>
       </w:pPr>
       <w:r>
-        <w:t>Introduced</w:t>
-      </w:r>
-      <w:r>
-        <w:t xml:space="preserve"> custom LRU in-memory IP-based rate limiting to protect public forms (e.g., Creator/Agency applications).</w:t>
+        <w:t>Declared the application free o</w:t>
+      </w:r>
+      <w:r>
+        <w:t>f Generative AI to align with SCS-GRP-025-EN.</w:t>
       </w:r>
     </w:p>
     <w:p>
@@ -4997,21 +5516,7 @@
         <w:spacing w:after="44"/>
       </w:pPr>
       <w:r>
-        <w:t xml:space="preserve">Addressed potential rendering bugs where UI layers incorrectly bypassed </w:t>
-      </w:r>
-      <w:proofErr w:type="spellStart"/>
-      <w:r>
-        <w:rPr>
-          <w:rFonts w:ascii="Consolas" w:eastAsia="Consolas" w:hAnsi="Consolas" w:cs="Consolas"/>
-          <w:sz w:val="20"/>
-          <w:szCs w:val="20"/>
-          <w:shd w:val="clear" w:color="auto" w:fill="F3F4F6"/>
-        </w:rPr>
-        <w:t>calculateHistoricalMetrics</w:t>
-      </w:r>
-      <w:proofErr w:type="spellEnd"/>
-      <w:r>
-        <w:t xml:space="preserve"> evaluations.</w:t>
+        <w:t>Noted CMDB onboarding requirements per G/O/T/003.</w:t>
       </w:r>
     </w:p>
     <w:p>
@@ -5034,7 +5539,7 @@
         <w:t>Version:</w:t>
       </w:r>
       <w:r>
-        <w:t xml:space="preserve"> 1.0</w:t>
+        <w:t xml:space="preserve"> 3.0</w:t>
       </w:r>
       <w:r>
         <w:br/>
@@ -5050,10 +5555,7 @@
         <w:t>Release Date:</w:t>
       </w:r>
       <w:r>
-        <w:t xml:space="preserve"> June 25, </w:t>
-      </w:r>
-      <w:r>
-        <w:t>2026</w:t>
+        <w:t xml:space="preserve"> July 22, 2026</w:t>
       </w:r>
       <w:r>
         <w:br/>
@@ -5069,7 +5571,7 @@
         <w:t>Summary:</w:t>
       </w:r>
       <w:r>
-        <w:t xml:space="preserve"> Baseline Production Release</w:t>
+        <w:t xml:space="preserve"> Corporate Security Compliance Alignment</w:t>
       </w:r>
     </w:p>
     <w:p>
@@ -5081,7 +5583,7 @@
           <w:b/>
           <w:bCs/>
         </w:rPr>
-        <w:t>New Features</w:t>
+        <w:t>Security Improvements</w:t>
       </w:r>
     </w:p>
     <w:p>
@@ -5094,7 +5596,15 @@
         <w:spacing w:after="44"/>
       </w:pPr>
       <w:r>
-        <w:t>Initial deployment of algorithmic Ranker Engine.</w:t>
+        <w:t xml:space="preserve">Enabled GitHub </w:t>
+      </w:r>
+      <w:proofErr w:type="spellStart"/>
+      <w:r>
+        <w:t>Dependabot</w:t>
+      </w:r>
+      <w:proofErr w:type="spellEnd"/>
+      <w:r>
+        <w:t xml:space="preserve"> for automated dependency scanning in alignment with the Secure Software Development Standard.</w:t>
       </w:r>
     </w:p>
     <w:p>
@@ -5107,7 +5617,15 @@
         <w:spacing w:after="44"/>
       </w:pPr>
       <w:r>
-        <w:t>Secure Creator Claim workflow via Magic Link.</w:t>
+        <w:t xml:space="preserve">Integrated GitHub </w:t>
+      </w:r>
+      <w:proofErr w:type="spellStart"/>
+      <w:r>
+        <w:t>CodeQL</w:t>
+      </w:r>
+      <w:proofErr w:type="spellEnd"/>
+      <w:r>
+        <w:t xml:space="preserve"> for automated Static Application Security Testing (SAST).</w:t>
       </w:r>
     </w:p>
     <w:p>
@@ -5120,19 +5638,18 @@
         <w:spacing w:after="44"/>
       </w:pPr>
       <w:r>
-        <w:t>Super Admin orchestration dashboard.</w:t>
-      </w:r>
-    </w:p>
-    <w:p>
-      <w:pPr>
-        <w:spacing w:after="132"/>
-      </w:pPr>
-      <w:r>
-        <w:rPr>
-          <w:b/>
-          <w:bCs/>
-        </w:rPr>
-        <w:t>Enhancements</w:t>
+        <w:t>Added a Responsible Disclosure Notice link to the pub</w:t>
+      </w:r>
+      <w:r>
+        <w:t xml:space="preserve">lic landing page to comply with </w:t>
+      </w:r>
+      <w:proofErr w:type="spellStart"/>
+      <w:r>
+        <w:t>Dentsu</w:t>
+      </w:r>
+      <w:proofErr w:type="spellEnd"/>
+      <w:r>
+        <w:t xml:space="preserve"> policy.</w:t>
       </w:r>
     </w:p>
     <w:p>
@@ -5145,11 +5662,16 @@
         <w:spacing w:after="44"/>
       </w:pPr>
       <w:r>
-        <w:t>Standardized canonical genre dropdowns across all creat</w:t>
-      </w:r>
-      <w:r>
-        <w:t>or, agency, and admin portals.</w:t>
-      </w:r>
+        <w:t>Formally aligned patching SLAs to the Vulnerability Management Standard (SCS-GRP-001-EN).</w:t>
+      </w:r>
+    </w:p>
+    <w:p>
+      <w:pPr>
+        <w:pBdr>
+          <w:bottom w:val="single" w:sz="6" w:space="0" w:color="D1D5DB"/>
+        </w:pBdr>
+        <w:spacing w:before="120" w:after="120"/>
+      </w:pPr>
     </w:p>
     <w:p>
       <w:pPr>
@@ -5160,7 +5682,54 @@
           <w:b/>
           <w:bCs/>
         </w:rPr>
-        <w:t>Security Improvements</w:t>
+        <w:t>Version:</w:t>
+      </w:r>
+      <w:r>
+        <w:t xml:space="preserve"> 2.0</w:t>
+      </w:r>
+      <w:r>
+        <w:br/>
+      </w:r>
+      <w:r>
+        <w:t xml:space="preserve"> </w:t>
+      </w:r>
+      <w:r>
+        <w:rPr>
+          <w:b/>
+          <w:bCs/>
+        </w:rPr>
+        <w:t>Release Date:</w:t>
+      </w:r>
+      <w:r>
+        <w:t xml:space="preserve"> July 21, 2026</w:t>
+      </w:r>
+      <w:r>
+        <w:br/>
+      </w:r>
+      <w:r>
+        <w:t xml:space="preserve"> </w:t>
+      </w:r>
+      <w:r>
+        <w:rPr>
+          <w:b/>
+          <w:bCs/>
+        </w:rPr>
+        <w:t>Summary:</w:t>
+      </w:r>
+      <w:r>
+        <w:t xml:space="preserve"> Security Hardening and Top Gainers Logic</w:t>
+      </w:r>
+    </w:p>
+    <w:p>
+      <w:pPr>
+        <w:spacing w:after="132"/>
+      </w:pPr>
+      <w:r>
+        <w:rPr>
+          <w:b/>
+          <w:bCs/>
+        </w:rPr>
+        <w:t>New Features</w:t>
       </w:r>
     </w:p>
     <w:p>
@@ -5173,7 +5742,10 @@
         <w:spacing w:after="44"/>
       </w:pPr>
       <w:r>
-        <w:t>Implementation of out-of-band email verification to prevent IDOR attacks during podcast claiming.</w:t>
+        <w:t>Introduced "</w:t>
+      </w:r>
+      <w:r>
+        <w:t>Top Gainers" and "Losers" filters on the main Labs Rankings, correctly isolating changes strictly within the Top 100.</w:t>
       </w:r>
     </w:p>
     <w:p>
@@ -5186,7 +5758,7 @@
         <w:spacing w:after="44"/>
       </w:pPr>
       <w:r>
-        <w:t>Strict Role-Based Access Control (RBAC) enforced on all server actions.</w:t>
+        <w:t>Implemented "NEW" badge logic to clearly distinguish brand-new entries breaking into the Top 100 without prior historical data.</w:t>
       </w:r>
     </w:p>
     <w:p>
@@ -5198,7 +5770,14 @@
           <w:b/>
           <w:bCs/>
         </w:rPr>
-        <w:t>Infrastructure Changes</w:t>
+        <w:t>Security I</w:t>
+      </w:r>
+      <w:r>
+        <w:rPr>
+          <w:b/>
+          <w:bCs/>
+        </w:rPr>
+        <w:t>mprovements</w:t>
       </w:r>
     </w:p>
     <w:p>
@@ -5211,15 +5790,57 @@
         <w:spacing w:after="44"/>
       </w:pPr>
       <w:r>
-        <w:t xml:space="preserve">PM2 production deployment on </w:t>
+        <w:t>Implemented strict HTTP Security Headers (</w:t>
+      </w:r>
+      <w:r>
+        <w:rPr>
+          <w:rFonts w:ascii="Consolas" w:eastAsia="Consolas" w:hAnsi="Consolas" w:cs="Consolas"/>
+          <w:sz w:val="20"/>
+          <w:szCs w:val="20"/>
+          <w:shd w:val="clear" w:color="auto" w:fill="F3F4F6"/>
+        </w:rPr>
+        <w:t>X-Frame-Options</w:t>
+      </w:r>
+      <w:r>
+        <w:t xml:space="preserve">, </w:t>
+      </w:r>
+      <w:r>
+        <w:rPr>
+          <w:rFonts w:ascii="Consolas" w:eastAsia="Consolas" w:hAnsi="Consolas" w:cs="Consolas"/>
+          <w:sz w:val="20"/>
+          <w:szCs w:val="20"/>
+          <w:shd w:val="clear" w:color="auto" w:fill="F3F4F6"/>
+        </w:rPr>
+        <w:t>X-Content-Type-Options</w:t>
+      </w:r>
+      <w:r>
+        <w:t xml:space="preserve">, </w:t>
+      </w:r>
+      <w:r>
+        <w:rPr>
+          <w:rFonts w:ascii="Consolas" w:eastAsia="Consolas" w:hAnsi="Consolas" w:cs="Consolas"/>
+          <w:sz w:val="20"/>
+          <w:szCs w:val="20"/>
+          <w:shd w:val="clear" w:color="auto" w:fill="F3F4F6"/>
+        </w:rPr>
+        <w:t>Strict-Transport-Security</w:t>
+      </w:r>
+      <w:r>
+        <w:t xml:space="preserve">) via </w:t>
       </w:r>
       <w:proofErr w:type="spellStart"/>
       <w:r>
-        <w:t>Hostinger</w:t>
+        <w:rPr>
+          <w:rFonts w:ascii="Consolas" w:eastAsia="Consolas" w:hAnsi="Consolas" w:cs="Consolas"/>
+          <w:sz w:val="20"/>
+          <w:szCs w:val="20"/>
+          <w:shd w:val="clear" w:color="auto" w:fill="F3F4F6"/>
+        </w:rPr>
+        <w:t>next.config.ts</w:t>
       </w:r>
       <w:proofErr w:type="spellEnd"/>
       <w:r>
-        <w:t xml:space="preserve"> VPS.</w:t>
+        <w:t>.</w:t>
       </w:r>
     </w:p>
     <w:p>
@@ -5231,18 +5852,266 @@
         </w:numPr>
         <w:spacing w:after="44"/>
       </w:pPr>
+      <w:r>
+        <w:lastRenderedPageBreak/>
+        <w:t>Introduced custom LRU in-memory IP-based rate limiting to protect public forms (e.g., Creator/Agency applications)</w:t>
+      </w:r>
+      <w:r>
+        <w:t>.</w:t>
+      </w:r>
+    </w:p>
+    <w:p>
+      <w:pPr>
+        <w:pStyle w:val="ListParagraph"/>
+        <w:numPr>
+          <w:ilvl w:val="0"/>
+          <w:numId w:val="1"/>
+        </w:numPr>
+        <w:spacing w:after="44"/>
+      </w:pPr>
+      <w:r>
+        <w:t xml:space="preserve">Addressed potential rendering bugs where UI layers incorrectly bypassed </w:t>
+      </w:r>
       <w:proofErr w:type="spellStart"/>
       <w:r>
+        <w:rPr>
+          <w:rFonts w:ascii="Consolas" w:eastAsia="Consolas" w:hAnsi="Consolas" w:cs="Consolas"/>
+          <w:sz w:val="20"/>
+          <w:szCs w:val="20"/>
+          <w:shd w:val="clear" w:color="auto" w:fill="F3F4F6"/>
+        </w:rPr>
+        <w:t>calculateHistoricalMetrics</w:t>
+      </w:r>
+      <w:proofErr w:type="spellEnd"/>
+      <w:r>
+        <w:t xml:space="preserve"> evaluations.</w:t>
+      </w:r>
+    </w:p>
+    <w:p>
+      <w:pPr>
+        <w:pBdr>
+          <w:bottom w:val="single" w:sz="6" w:space="0" w:color="D1D5DB"/>
+        </w:pBdr>
+        <w:spacing w:before="120" w:after="120"/>
+      </w:pPr>
+    </w:p>
+    <w:p>
+      <w:pPr>
+        <w:spacing w:after="132"/>
+      </w:pPr>
+      <w:r>
+        <w:rPr>
+          <w:b/>
+          <w:bCs/>
+        </w:rPr>
+        <w:t>Version:</w:t>
+      </w:r>
+      <w:r>
+        <w:t xml:space="preserve"> 1.0</w:t>
+      </w:r>
+      <w:r>
+        <w:br/>
+      </w:r>
+      <w:r>
+        <w:t xml:space="preserve"> </w:t>
+      </w:r>
+      <w:r>
+        <w:rPr>
+          <w:b/>
+          <w:bCs/>
+        </w:rPr>
+        <w:t>Release Date:</w:t>
+      </w:r>
+      <w:r>
+        <w:t xml:space="preserve"> June 25, 2026</w:t>
+      </w:r>
+      <w:r>
+        <w:br/>
+      </w:r>
+      <w:r>
+        <w:t xml:space="preserve"> </w:t>
+      </w:r>
+      <w:r>
+        <w:rPr>
+          <w:b/>
+          <w:bCs/>
+        </w:rPr>
+        <w:t>Summary:</w:t>
+      </w:r>
+      <w:r>
+        <w:t xml:space="preserve"> Baseline Production Release</w:t>
+      </w:r>
+    </w:p>
+    <w:p>
+      <w:pPr>
+        <w:spacing w:after="132"/>
+      </w:pPr>
+      <w:r>
+        <w:rPr>
+          <w:b/>
+          <w:bCs/>
+        </w:rPr>
+        <w:t>New Features</w:t>
+      </w:r>
+    </w:p>
+    <w:p>
+      <w:pPr>
+        <w:pStyle w:val="ListParagraph"/>
+        <w:numPr>
+          <w:ilvl w:val="0"/>
+          <w:numId w:val="1"/>
+        </w:numPr>
+        <w:spacing w:after="44"/>
+      </w:pPr>
+      <w:r>
+        <w:t>Initial deployment of algorithmic Ranker Engine.</w:t>
+      </w:r>
+    </w:p>
+    <w:p>
+      <w:pPr>
+        <w:pStyle w:val="ListParagraph"/>
+        <w:numPr>
+          <w:ilvl w:val="0"/>
+          <w:numId w:val="1"/>
+        </w:numPr>
+        <w:spacing w:after="44"/>
+      </w:pPr>
+      <w:r>
+        <w:t>Secure Creator Claim workflow via Magic Link.</w:t>
+      </w:r>
+    </w:p>
+    <w:p>
+      <w:pPr>
+        <w:pStyle w:val="ListParagraph"/>
+        <w:numPr>
+          <w:ilvl w:val="0"/>
+          <w:numId w:val="1"/>
+        </w:numPr>
+        <w:spacing w:after="44"/>
+      </w:pPr>
+      <w:r>
+        <w:t>Super Admin orchestration dashboard.</w:t>
+      </w:r>
+    </w:p>
+    <w:p>
+      <w:pPr>
+        <w:spacing w:after="132"/>
+      </w:pPr>
+      <w:r>
+        <w:rPr>
+          <w:b/>
+          <w:bCs/>
+        </w:rPr>
+        <w:t>Enhancements</w:t>
+      </w:r>
+    </w:p>
+    <w:p>
+      <w:pPr>
+        <w:pStyle w:val="ListParagraph"/>
+        <w:numPr>
+          <w:ilvl w:val="0"/>
+          <w:numId w:val="1"/>
+        </w:numPr>
+        <w:spacing w:after="44"/>
+      </w:pPr>
+      <w:r>
+        <w:t>Standardized canonical genre dropdowns across all creator, agency, and admin portals.</w:t>
+      </w:r>
+    </w:p>
+    <w:p>
+      <w:pPr>
+        <w:spacing w:after="132"/>
+      </w:pPr>
+      <w:r>
+        <w:rPr>
+          <w:b/>
+          <w:bCs/>
+        </w:rPr>
+        <w:t>Security Improvements</w:t>
+      </w:r>
+    </w:p>
+    <w:p>
+      <w:pPr>
+        <w:pStyle w:val="ListParagraph"/>
+        <w:numPr>
+          <w:ilvl w:val="0"/>
+          <w:numId w:val="1"/>
+        </w:numPr>
+        <w:spacing w:after="44"/>
+      </w:pPr>
+      <w:r>
+        <w:t>Implementation of out-of-band email verification to prevent IDOR attacks during podcast claiming.</w:t>
+      </w:r>
+    </w:p>
+    <w:p>
+      <w:pPr>
+        <w:pStyle w:val="ListParagraph"/>
+        <w:numPr>
+          <w:ilvl w:val="0"/>
+          <w:numId w:val="1"/>
+        </w:numPr>
+        <w:spacing w:after="44"/>
+      </w:pPr>
+      <w:r>
+        <w:t>Strict Role-Based Access Control (RBAC) enforced on all server actions.</w:t>
+      </w:r>
+    </w:p>
+    <w:p>
+      <w:pPr>
+        <w:spacing w:after="132"/>
+      </w:pPr>
+      <w:r>
+        <w:rPr>
+          <w:b/>
+          <w:bCs/>
+        </w:rPr>
+        <w:t>Infrastructure Changes</w:t>
+      </w:r>
+    </w:p>
+    <w:p>
+      <w:pPr>
+        <w:pStyle w:val="ListParagraph"/>
+        <w:numPr>
+          <w:ilvl w:val="0"/>
+          <w:numId w:val="1"/>
+        </w:numPr>
+        <w:spacing w:after="44"/>
+      </w:pPr>
+      <w:r>
+        <w:t xml:space="preserve">PM2 production deployment on </w:t>
+      </w:r>
+      <w:proofErr w:type="spellStart"/>
+      <w:r>
+        <w:t>Hostinger</w:t>
+      </w:r>
+      <w:proofErr w:type="spellEnd"/>
+      <w:r>
+        <w:t xml:space="preserve"> VPS.</w:t>
+      </w:r>
+    </w:p>
+    <w:p>
+      <w:pPr>
+        <w:pStyle w:val="ListParagraph"/>
+        <w:numPr>
+          <w:ilvl w:val="0"/>
+          <w:numId w:val="1"/>
+        </w:numPr>
+        <w:spacing w:after="44"/>
+      </w:pPr>
+      <w:proofErr w:type="spellStart"/>
+      <w:r>
         <w:t>Supabase</w:t>
       </w:r>
       <w:proofErr w:type="spellEnd"/>
       <w:r>
-        <w:t xml:space="preserve"> integration configured for Auth and Database persistence.</w:t>
+        <w:t xml:space="preserve"> integratio</w:t>
+      </w:r>
+      <w:r>
+        <w:t>n configured for Auth and Database persistence.</w:t>
       </w:r>
     </w:p>
     <w:sectPr>
       <w:headerReference w:type="default" r:id="rId10"/>
-      <w:footerReference w:type="default" r:id="rId11"/>
       <w:pgSz w:w="11906" w:h="16838"/>
       <w:pgMar w:top="800" w:right="800" w:bottom="800" w:left="800" w:header="708" w:footer="708" w:gutter="0"/>
       <w:cols w:space="720"/>
@@ -5275,137 +6144,6 @@
     </w:p>
   </w:endnote>
 </w:endnotes>
-</file>
-
-<file path=word/footer1.xml><?xml version="1.0" encoding="utf-8"?>
-<w:ftr xmlns:wpc="http://schemas.microsoft.com/office/word/2010/wordprocessingCanvas" xmlns:cx="http://schemas.microsoft.com/office/drawing/2014/chartex" xmlns:cx1="http://schemas.microsoft.com/office/drawing/2015/9/8/chartex" xmlns:cx2="http://schemas.microsoft.com/office/drawing/2015/10/21/chartex" xmlns:cx3="http://schemas.microsoft.com/office/drawing/2016/5/9/chartex" xmlns:cx4="http://schemas.microsoft.com/office/drawing/2016/5/10/chartex" xmlns:cx5="http://schemas.microsoft.com/office/drawing/2016/5/11/chartex" xmlns:cx6="http://schemas.microsoft.com/office/drawing/2016/5/12/chartex" xmlns:cx7="http://schemas.microsoft.com/office/drawing/2016/5/13/chartex" xmlns:cx8="http://schemas.microsoft.com/office/drawing/2016/5/14/chartex" xmlns:mc="http://schemas.openxmlformats.org/markup-compatibility/2006" xmlns:aink="http://schemas.microsoft.com/office/drawing/2016/ink" xmlns:am3d="http://schemas.microsoft.com/office/drawing/2017/model3d" xmlns:o="urn:schemas-microsoft-com:office:office" xmlns:r="http://schemas.openxmlformats.org/officeDocument/2006/relationships" xmlns:m="http://schemas.openxmlformats.org/officeDocument/2006/math" xmlns:v="urn:schemas-microsoft-com:vml" xmlns:wp14="http://schemas.microsoft.com/office/word/2010/wordprocessingDrawing" xmlns:wp="http://schemas.openxmlformats.org/drawingml/2006/wordprocessingDrawing" xmlns:w10="urn:schemas-microsoft-com:office:word" xmlns:w="http://schemas.openxmlformats.org/wordprocessingml/2006/main" xmlns:w14="http://schemas.microsoft.com/office/word/2010/wordml" xmlns:w15="http://schemas.microsoft.com/office/word/2012/wordml" xmlns:w16cex="http://schemas.microsoft.com/office/word/2018/wordml/cex" xmlns:w16cid="http://schemas.microsoft.com/office/word/2016/wordml/cid" xmlns:w16="http://schemas.microsoft.com/office/word/2018/wordml" xmlns:w16sdtdh="http://schemas.microsoft.com/office/word/2020/wordml/sdtdatahash" xmlns:w16se="http://schemas.microsoft.com/office/word/2015/wordml/symex" xmlns:wpg="http://schemas.microsoft.com/office/word/2010/wordprocessingGroup" xmlns:wpi="http://schemas.microsoft.com/office/word/2010/wordprocessingInk" xmlns:wne="http://schemas.microsoft.com/office/word/2006/wordml" xmlns:wps="http://schemas.microsoft.com/office/word/2010/wordprocessingShape" mc:Ignorable="w14 w15 w16se w16cid w16 w16cex w16sdtdh wp14">
-  <w:sdt>
-    <w:sdtPr>
-      <w:id w:val="1289704876"/>
-      <w:docPartObj>
-        <w:docPartGallery w:val="Page Numbers (Bottom of Page)"/>
-        <w:docPartUnique/>
-      </w:docPartObj>
-    </w:sdtPr>
-    <w:sdtContent>
-      <w:sdt>
-        <w:sdtPr>
-          <w:id w:val="1728636285"/>
-          <w:docPartObj>
-            <w:docPartGallery w:val="Page Numbers (Top of Page)"/>
-            <w:docPartUnique/>
-          </w:docPartObj>
-        </w:sdtPr>
-        <w:sdtContent>
-          <w:p>
-            <w:pPr>
-              <w:pStyle w:val="Footer"/>
-              <w:pBdr>
-                <w:top w:val="single" w:sz="4" w:space="1" w:color="auto"/>
-              </w:pBdr>
-              <w:jc w:val="center"/>
-            </w:pPr>
-            <w:r>
-              <w:t xml:space="preserve">Page </w:t>
-            </w:r>
-            <w:r>
-              <w:rPr>
-                <w:b/>
-                <w:bCs/>
-                <w:sz w:val="24"/>
-                <w:szCs w:val="24"/>
-              </w:rPr>
-              <w:fldChar w:fldCharType="begin"/>
-            </w:r>
-            <w:r>
-              <w:rPr>
-                <w:b/>
-                <w:bCs/>
-              </w:rPr>
-              <w:instrText xml:space="preserve"> PAGE </w:instrText>
-            </w:r>
-            <w:r>
-              <w:rPr>
-                <w:b/>
-                <w:bCs/>
-                <w:sz w:val="24"/>
-                <w:szCs w:val="24"/>
-              </w:rPr>
-              <w:fldChar w:fldCharType="separate"/>
-            </w:r>
-            <w:r>
-              <w:rPr>
-                <w:b/>
-                <w:bCs/>
-                <w:noProof/>
-              </w:rPr>
-              <w:t>2</w:t>
-            </w:r>
-            <w:r>
-              <w:rPr>
-                <w:b/>
-                <w:bCs/>
-                <w:sz w:val="24"/>
-                <w:szCs w:val="24"/>
-              </w:rPr>
-              <w:fldChar w:fldCharType="end"/>
-            </w:r>
-            <w:r>
-              <w:t xml:space="preserve"> of </w:t>
-            </w:r>
-            <w:r>
-              <w:rPr>
-                <w:b/>
-                <w:bCs/>
-                <w:sz w:val="24"/>
-                <w:szCs w:val="24"/>
-              </w:rPr>
-              <w:fldChar w:fldCharType="begin"/>
-            </w:r>
-            <w:r>
-              <w:rPr>
-                <w:b/>
-                <w:bCs/>
-              </w:rPr>
-              <w:instrText xml:space="preserve"> NUMPAGES  </w:instrText>
-            </w:r>
-            <w:r>
-              <w:rPr>
-                <w:b/>
-                <w:bCs/>
-                <w:sz w:val="24"/>
-                <w:szCs w:val="24"/>
-              </w:rPr>
-              <w:fldChar w:fldCharType="separate"/>
-            </w:r>
-            <w:r>
-              <w:rPr>
-                <w:b/>
-                <w:bCs/>
-                <w:noProof/>
-              </w:rPr>
-              <w:t>2</w:t>
-            </w:r>
-            <w:r>
-              <w:rPr>
-                <w:b/>
-                <w:bCs/>
-                <w:sz w:val="24"/>
-                <w:szCs w:val="24"/>
-              </w:rPr>
-              <w:fldChar w:fldCharType="end"/>
-            </w:r>
-          </w:p>
-        </w:sdtContent>
-      </w:sdt>
-    </w:sdtContent>
-  </w:sdt>
-  <w:p>
-    <w:pPr>
-      <w:pStyle w:val="Footer"/>
-    </w:pPr>
-  </w:p>
-</w:ftr>
 </file>
 
 <file path=word/footnotes.xml><?xml version="1.0" encoding="utf-8"?>
@@ -5461,96 +6199,10 @@
 <file path=word/numbering.xml><?xml version="1.0" encoding="utf-8"?>
 <w:numbering xmlns:wpc="http://schemas.microsoft.com/office/word/2010/wordprocessingCanvas" xmlns:cx="http://schemas.microsoft.com/office/drawing/2014/chartex" xmlns:cx1="http://schemas.microsoft.com/office/drawing/2015/9/8/chartex" xmlns:cx2="http://schemas.microsoft.com/office/drawing/2015/10/21/chartex" xmlns:cx3="http://schemas.microsoft.com/office/drawing/2016/5/9/chartex" xmlns:cx4="http://schemas.microsoft.com/office/drawing/2016/5/10/chartex" xmlns:cx5="http://schemas.microsoft.com/office/drawing/2016/5/11/chartex" xmlns:cx6="http://schemas.microsoft.com/office/drawing/2016/5/12/chartex" xmlns:cx7="http://schemas.microsoft.com/office/drawing/2016/5/13/chartex" xmlns:cx8="http://schemas.microsoft.com/office/drawing/2016/5/14/chartex" xmlns:mc="http://schemas.openxmlformats.org/markup-compatibility/2006" xmlns:aink="http://schemas.microsoft.com/office/drawing/2016/ink" xmlns:am3d="http://schemas.microsoft.com/office/drawing/2017/model3d" xmlns:o="urn:schemas-microsoft-com:office:office" xmlns:r="http://schemas.openxmlformats.org/officeDocument/2006/relationships" xmlns:m="http://schemas.openxmlformats.org/officeDocument/2006/math" xmlns:v="urn:schemas-microsoft-com:vml" xmlns:wp14="http://schemas.microsoft.com/office/word/2010/wordprocessingDrawing" xmlns:wp="http://schemas.openxmlformats.org/drawingml/2006/wordprocessingDrawing" xmlns:w10="urn:schemas-microsoft-com:office:word" xmlns:w="http://schemas.openxmlformats.org/wordprocessingml/2006/main" xmlns:w14="http://schemas.microsoft.com/office/word/2010/wordml" xmlns:w15="http://schemas.microsoft.com/office/word/2012/wordml" xmlns:w16cex="http://schemas.microsoft.com/office/word/2018/wordml/cex" xmlns:w16cid="http://schemas.microsoft.com/office/word/2016/wordml/cid" xmlns:w16="http://schemas.microsoft.com/office/word/2018/wordml" xmlns:w16sdtdh="http://schemas.microsoft.com/office/word/2020/wordml/sdtdatahash" xmlns:w16se="http://schemas.microsoft.com/office/word/2015/wordml/symex" xmlns:wpg="http://schemas.microsoft.com/office/word/2010/wordprocessingGroup" xmlns:wpi="http://schemas.microsoft.com/office/word/2010/wordprocessingInk" xmlns:wne="http://schemas.microsoft.com/office/word/2006/wordml" xmlns:wps="http://schemas.microsoft.com/office/word/2010/wordprocessingShape" mc:Ignorable="w14 w15 w16se w16cid w16 w16cex w16sdtdh wp14">
   <w:abstractNum w:abstractNumId="0" w15:restartNumberingAfterBreak="0">
-    <w:nsid w:val="0803056F"/>
+    <w:nsid w:val="126305C1"/>
     <w:multiLevelType w:val="hybridMultilevel"/>
-    <w:tmpl w:val="4AE6D6D8"/>
-    <w:lvl w:ilvl="0" w:tplc="B6D6D612">
-      <w:start w:val="1"/>
-      <w:numFmt w:val="bullet"/>
-      <w:lvlText w:val="●"/>
-      <w:lvlJc w:val="left"/>
-      <w:pPr>
-        <w:ind w:left="720" w:hanging="360"/>
-      </w:pPr>
-    </w:lvl>
-    <w:lvl w:ilvl="1" w:tplc="FFFAD0D4">
-      <w:start w:val="1"/>
-      <w:numFmt w:val="bullet"/>
-      <w:lvlText w:val="○"/>
-      <w:lvlJc w:val="left"/>
-      <w:pPr>
-        <w:ind w:left="1440" w:hanging="360"/>
-      </w:pPr>
-    </w:lvl>
-    <w:lvl w:ilvl="2" w:tplc="047EAF2A">
-      <w:start w:val="1"/>
-      <w:numFmt w:val="bullet"/>
-      <w:lvlText w:val="■"/>
-      <w:lvlJc w:val="left"/>
-      <w:pPr>
-        <w:ind w:left="2160" w:hanging="360"/>
-      </w:pPr>
-    </w:lvl>
-    <w:lvl w:ilvl="3" w:tplc="4E569E5A">
-      <w:start w:val="1"/>
-      <w:numFmt w:val="bullet"/>
-      <w:lvlText w:val="●"/>
-      <w:lvlJc w:val="left"/>
-      <w:pPr>
-        <w:ind w:left="2880" w:hanging="360"/>
-      </w:pPr>
-    </w:lvl>
-    <w:lvl w:ilvl="4" w:tplc="54F0F9DC">
-      <w:start w:val="1"/>
-      <w:numFmt w:val="bullet"/>
-      <w:lvlText w:val="○"/>
-      <w:lvlJc w:val="left"/>
-      <w:pPr>
-        <w:ind w:left="3600" w:hanging="360"/>
-      </w:pPr>
-    </w:lvl>
-    <w:lvl w:ilvl="5" w:tplc="3446B074">
-      <w:start w:val="1"/>
-      <w:numFmt w:val="bullet"/>
-      <w:lvlText w:val="■"/>
-      <w:lvlJc w:val="left"/>
-      <w:pPr>
-        <w:ind w:left="4320" w:hanging="360"/>
-      </w:pPr>
-    </w:lvl>
-    <w:lvl w:ilvl="6" w:tplc="BFA6C19E">
-      <w:start w:val="1"/>
-      <w:numFmt w:val="bullet"/>
-      <w:lvlText w:val="●"/>
-      <w:lvlJc w:val="left"/>
-      <w:pPr>
-        <w:ind w:left="5040" w:hanging="360"/>
-      </w:pPr>
-    </w:lvl>
-    <w:lvl w:ilvl="7" w:tplc="686A38DE">
-      <w:start w:val="1"/>
-      <w:numFmt w:val="bullet"/>
-      <w:lvlText w:val="●"/>
-      <w:lvlJc w:val="left"/>
-      <w:pPr>
-        <w:ind w:left="5760" w:hanging="360"/>
-      </w:pPr>
-    </w:lvl>
-    <w:lvl w:ilvl="8" w:tplc="22706C0E">
-      <w:start w:val="1"/>
-      <w:numFmt w:val="bullet"/>
-      <w:lvlText w:val="●"/>
-      <w:lvlJc w:val="left"/>
-      <w:pPr>
-        <w:ind w:left="6480" w:hanging="360"/>
-      </w:pPr>
-    </w:lvl>
-  </w:abstractNum>
-  <w:abstractNum w:abstractNumId="1" w15:restartNumberingAfterBreak="0">
-    <w:nsid w:val="5E9C4581"/>
-    <w:multiLevelType w:val="hybridMultilevel"/>
-    <w:tmpl w:val="56848FB8"/>
-    <w:lvl w:ilvl="0" w:tplc="0DC46844">
+    <w:tmpl w:val="F76C9396"/>
+    <w:lvl w:ilvl="0" w:tplc="7E38CD80">
       <w:start w:val="1"/>
       <w:numFmt w:val="decimal"/>
       <w:lvlText w:val="%1."/>
@@ -5559,7 +6211,7 @@
         <w:ind w:left="360" w:hanging="360"/>
       </w:pPr>
     </w:lvl>
-    <w:lvl w:ilvl="1" w:tplc="595EFB3A">
+    <w:lvl w:ilvl="1" w:tplc="292CF5C2">
       <w:start w:val="1"/>
       <w:numFmt w:val="decimal"/>
       <w:lvlText w:val="%2."/>
@@ -5568,7 +6220,7 @@
         <w:ind w:left="720" w:hanging="360"/>
       </w:pPr>
     </w:lvl>
-    <w:lvl w:ilvl="2" w:tplc="62365060">
+    <w:lvl w:ilvl="2" w:tplc="D472D374">
       <w:start w:val="1"/>
       <w:numFmt w:val="decimal"/>
       <w:lvlText w:val="%3."/>
@@ -5577,7 +6229,7 @@
         <w:ind w:left="1080" w:hanging="360"/>
       </w:pPr>
     </w:lvl>
-    <w:lvl w:ilvl="3" w:tplc="D0F29298">
+    <w:lvl w:ilvl="3" w:tplc="91F83E84">
       <w:start w:val="1"/>
       <w:numFmt w:val="decimal"/>
       <w:lvlText w:val="%4."/>
@@ -5586,40 +6238,126 @@
         <w:ind w:left="1440" w:hanging="360"/>
       </w:pPr>
     </w:lvl>
-    <w:lvl w:ilvl="4" w:tplc="78586EDA">
+    <w:lvl w:ilvl="4" w:tplc="D5AA9C5C">
       <w:numFmt w:val="decimal"/>
       <w:lvlText w:val=""/>
       <w:lvlJc w:val="left"/>
     </w:lvl>
-    <w:lvl w:ilvl="5" w:tplc="2236CAF2">
+    <w:lvl w:ilvl="5" w:tplc="26782424">
       <w:numFmt w:val="decimal"/>
       <w:lvlText w:val=""/>
       <w:lvlJc w:val="left"/>
     </w:lvl>
-    <w:lvl w:ilvl="6" w:tplc="1F3EDD86">
+    <w:lvl w:ilvl="6" w:tplc="C68C8DBC">
       <w:numFmt w:val="decimal"/>
       <w:lvlText w:val=""/>
       <w:lvlJc w:val="left"/>
     </w:lvl>
-    <w:lvl w:ilvl="7" w:tplc="F1061024">
+    <w:lvl w:ilvl="7" w:tplc="E1E46BC0">
       <w:numFmt w:val="decimal"/>
       <w:lvlText w:val=""/>
       <w:lvlJc w:val="left"/>
     </w:lvl>
-    <w:lvl w:ilvl="8" w:tplc="9E9C49A0">
+    <w:lvl w:ilvl="8" w:tplc="3768EE8A">
       <w:numFmt w:val="decimal"/>
       <w:lvlText w:val=""/>
       <w:lvlJc w:val="left"/>
     </w:lvl>
   </w:abstractNum>
+  <w:abstractNum w:abstractNumId="1" w15:restartNumberingAfterBreak="0">
+    <w:nsid w:val="5EA93293"/>
+    <w:multiLevelType w:val="hybridMultilevel"/>
+    <w:tmpl w:val="C7909C22"/>
+    <w:lvl w:ilvl="0" w:tplc="559C9476">
+      <w:start w:val="1"/>
+      <w:numFmt w:val="bullet"/>
+      <w:lvlText w:val="●"/>
+      <w:lvlJc w:val="left"/>
+      <w:pPr>
+        <w:ind w:left="720" w:hanging="360"/>
+      </w:pPr>
+    </w:lvl>
+    <w:lvl w:ilvl="1" w:tplc="F9D4E818">
+      <w:start w:val="1"/>
+      <w:numFmt w:val="bullet"/>
+      <w:lvlText w:val="○"/>
+      <w:lvlJc w:val="left"/>
+      <w:pPr>
+        <w:ind w:left="1440" w:hanging="360"/>
+      </w:pPr>
+    </w:lvl>
+    <w:lvl w:ilvl="2" w:tplc="92820F5C">
+      <w:start w:val="1"/>
+      <w:numFmt w:val="bullet"/>
+      <w:lvlText w:val="■"/>
+      <w:lvlJc w:val="left"/>
+      <w:pPr>
+        <w:ind w:left="2160" w:hanging="360"/>
+      </w:pPr>
+    </w:lvl>
+    <w:lvl w:ilvl="3" w:tplc="86D8AA22">
+      <w:start w:val="1"/>
+      <w:numFmt w:val="bullet"/>
+      <w:lvlText w:val="●"/>
+      <w:lvlJc w:val="left"/>
+      <w:pPr>
+        <w:ind w:left="2880" w:hanging="360"/>
+      </w:pPr>
+    </w:lvl>
+    <w:lvl w:ilvl="4" w:tplc="8AC2A94C">
+      <w:start w:val="1"/>
+      <w:numFmt w:val="bullet"/>
+      <w:lvlText w:val="○"/>
+      <w:lvlJc w:val="left"/>
+      <w:pPr>
+        <w:ind w:left="3600" w:hanging="360"/>
+      </w:pPr>
+    </w:lvl>
+    <w:lvl w:ilvl="5" w:tplc="54A6DE9E">
+      <w:start w:val="1"/>
+      <w:numFmt w:val="bullet"/>
+      <w:lvlText w:val="■"/>
+      <w:lvlJc w:val="left"/>
+      <w:pPr>
+        <w:ind w:left="4320" w:hanging="360"/>
+      </w:pPr>
+    </w:lvl>
+    <w:lvl w:ilvl="6" w:tplc="E9C4897C">
+      <w:start w:val="1"/>
+      <w:numFmt w:val="bullet"/>
+      <w:lvlText w:val="●"/>
+      <w:lvlJc w:val="left"/>
+      <w:pPr>
+        <w:ind w:left="5040" w:hanging="360"/>
+      </w:pPr>
+    </w:lvl>
+    <w:lvl w:ilvl="7" w:tplc="DC46E77E">
+      <w:start w:val="1"/>
+      <w:numFmt w:val="bullet"/>
+      <w:lvlText w:val="●"/>
+      <w:lvlJc w:val="left"/>
+      <w:pPr>
+        <w:ind w:left="5760" w:hanging="360"/>
+      </w:pPr>
+    </w:lvl>
+    <w:lvl w:ilvl="8" w:tplc="6DF0215C">
+      <w:start w:val="1"/>
+      <w:numFmt w:val="bullet"/>
+      <w:lvlText w:val="●"/>
+      <w:lvlJc w:val="left"/>
+      <w:pPr>
+        <w:ind w:left="6480" w:hanging="360"/>
+      </w:pPr>
+    </w:lvl>
+  </w:abstractNum>
   <w:num w:numId="1">
-    <w:abstractNumId w:val="0"/>
+    <w:abstractNumId w:val="1"/>
     <w:lvlOverride w:ilvl="0">
       <w:startOverride w:val="1"/>
     </w:lvlOverride>
   </w:num>
   <w:num w:numId="2">
-    <w:abstractNumId w:val="1"/>
+    <w:abstractNumId w:val="0"/>
     <w:lvlOverride w:ilvl="0">
       <w:startOverride w:val="1"/>
     </w:lvlOverride>
@@ -6240,7 +6978,7 @@
     <w:link w:val="HeaderChar"/>
     <w:uiPriority w:val="99"/>
     <w:unhideWhenUsed/>
-    <w:rsid w:val="00DB09E9"/>
+    <w:rsid w:val="0077387A"/>
     <w:pPr>
       <w:tabs>
         <w:tab w:val="center" w:pos="4513"/>
@@ -6254,7 +6992,7 @@
     <w:basedOn w:val="DefaultParagraphFont"/>
     <w:link w:val="Header"/>
     <w:uiPriority w:val="99"/>
-    <w:rsid w:val="00DB09E9"/>
+    <w:rsid w:val="0077387A"/>
   </w:style>
   <w:style w:type="paragraph" w:styleId="Footer">
     <w:name w:val="footer"/>
@@ -6262,7 +7000,7 @@
     <w:link w:val="FooterChar"/>
     <w:uiPriority w:val="99"/>
     <w:unhideWhenUsed/>
-    <w:rsid w:val="00DB09E9"/>
+    <w:rsid w:val="0077387A"/>
     <w:pPr>
       <w:tabs>
         <w:tab w:val="center" w:pos="4513"/>
@@ -6276,7 +7014,7 @@
     <w:basedOn w:val="DefaultParagraphFont"/>
     <w:link w:val="Footer"/>
     <w:uiPriority w:val="99"/>
-    <w:rsid w:val="00DB09E9"/>
+    <w:rsid w:val="0077387A"/>
   </w:style>
 </w:styles>
 </file>

</xml_diff>